<commit_message>
Integrate frozen 20260914 WEB TEST release; preserve WEB auth and historical read-only chat selection
</commit_message>
<xml_diff>
--- a/templates/violation_protocols/decline_p49_1_2.docx
+++ b/templates/violation_protocols/decline_p49_1_2.docx
@@ -8,21 +8,12 @@
         <w:jc w:val="center"/>
         <w:rPr>
           <w:rFonts w:ascii="Times New Roman" w:eastAsia="Times New Roman" w:hAnsi="Times New Roman" w:cs="Times New Roman"/>
-          <w:sz w:val="24"/>
-          <w:szCs w:val="24"/>
-          <w:shd w:val="clear" w:color="auto" w:fill="FF9900"/>
-        </w:rPr>
-      </w:pPr>
-      <w:r>
-        <w:rPr>
-          <w:rFonts w:ascii="Times New Roman" w:eastAsia="Times New Roman" w:hAnsi="Times New Roman" w:cs="Times New Roman"/>
           <w:b/>
           <w:bCs/>
           <w:sz w:val="24"/>
           <w:szCs w:val="24"/>
         </w:rPr>
-        <w:t>ПРОТОКОЛЬНЕ РІШЕННЯ № </w:t>
-      </w:r>
+      </w:pPr>
       <w:r>
         <w:rPr>
           <w:rFonts w:ascii="Times New Roman" w:eastAsia="Times New Roman" w:hAnsi="Times New Roman" w:cs="Times New Roman"/>
@@ -30,9 +21,30 @@
           <w:bCs/>
           <w:sz w:val="24"/>
           <w:szCs w:val="24"/>
-          <w:shd w:val="clear" w:color="auto" w:fill="FF9900"/>
-        </w:rPr>
-        <w:t>{{ protocol_number }}</w:t>
+        </w:rPr>
+        <w:t xml:space="preserve">ПРОТОКОЛЬНЕ РІШЕННЯ № {{ </w:t>
+      </w:r>
+      <w:proofErr w:type="spellStart"/>
+      <w:r>
+        <w:rPr>
+          <w:rFonts w:ascii="Times New Roman" w:eastAsia="Times New Roman" w:hAnsi="Times New Roman" w:cs="Times New Roman"/>
+          <w:b/>
+          <w:bCs/>
+          <w:sz w:val="24"/>
+          <w:szCs w:val="24"/>
+        </w:rPr>
+        <w:t>protocol_number</w:t>
+      </w:r>
+      <w:proofErr w:type="spellEnd"/>
+      <w:r>
+        <w:rPr>
+          <w:rFonts w:ascii="Times New Roman" w:eastAsia="Times New Roman" w:hAnsi="Times New Roman" w:cs="Times New Roman"/>
+          <w:b/>
+          <w:bCs/>
+          <w:sz w:val="24"/>
+          <w:szCs w:val="24"/>
+        </w:rPr>
+        <w:t xml:space="preserve"> }}</w:t>
       </w:r>
     </w:p>
     <w:p>
@@ -74,8 +86,9 @@
           <w:sz w:val="24"/>
           <w:szCs w:val="24"/>
         </w:rPr>
-        <w:t xml:space="preserve">за результатами розгляду звернення № </w:t>
-      </w:r>
+        <w:t xml:space="preserve">за результатами розгляду звернення № {{ </w:t>
+      </w:r>
+      <w:proofErr w:type="spellStart"/>
       <w:r>
         <w:rPr>
           <w:rFonts w:ascii="Times New Roman" w:eastAsia="Times New Roman" w:hAnsi="Times New Roman" w:cs="Times New Roman"/>
@@ -84,7 +97,18 @@
           <w:sz w:val="24"/>
           <w:szCs w:val="24"/>
         </w:rPr>
-        <w:t>{{ report_id }}</w:t>
+        <w:t>report_id</w:t>
+      </w:r>
+      <w:proofErr w:type="spellEnd"/>
+      <w:r>
+        <w:rPr>
+          <w:rFonts w:ascii="Times New Roman" w:eastAsia="Times New Roman" w:hAnsi="Times New Roman" w:cs="Times New Roman"/>
+          <w:b/>
+          <w:bCs/>
+          <w:sz w:val="24"/>
+          <w:szCs w:val="24"/>
+        </w:rPr>
+        <w:t xml:space="preserve"> }}</w:t>
       </w:r>
     </w:p>
     <w:p>
@@ -95,7 +119,6 @@
           <w:rFonts w:ascii="Times New Roman" w:eastAsia="Times New Roman" w:hAnsi="Times New Roman" w:cs="Times New Roman"/>
           <w:sz w:val="24"/>
           <w:szCs w:val="24"/>
-          <w:highlight w:val="yellow"/>
         </w:rPr>
       </w:pPr>
       <w:r>
@@ -108,6 +131,7 @@
         </w:rPr>
         <w:t xml:space="preserve">(закупівля {{ </w:t>
       </w:r>
+      <w:proofErr w:type="spellStart"/>
       <w:r>
         <w:rPr>
           <w:rFonts w:ascii="Times New Roman" w:eastAsia="Times New Roman" w:hAnsi="Times New Roman" w:cs="Times New Roman"/>
@@ -118,6 +142,7 @@
         </w:rPr>
         <w:t>procurement_id</w:t>
       </w:r>
+      <w:proofErr w:type="spellEnd"/>
       <w:r>
         <w:rPr>
           <w:rFonts w:ascii="Times New Roman" w:eastAsia="Times New Roman" w:hAnsi="Times New Roman" w:cs="Times New Roman"/>
@@ -172,25 +197,24 @@
                 <w:rFonts w:ascii="Times New Roman" w:eastAsia="Times New Roman" w:hAnsi="Times New Roman" w:cs="Times New Roman"/>
                 <w:sz w:val="24"/>
                 <w:szCs w:val="24"/>
-                <w:shd w:val="clear" w:color="auto" w:fill="FF9900"/>
               </w:rPr>
               <w:t>{{</w:t>
             </w:r>
+            <w:proofErr w:type="spellStart"/>
             <w:r>
               <w:rPr>
                 <w:rFonts w:ascii="Times New Roman" w:eastAsia="Times New Roman" w:hAnsi="Times New Roman" w:cs="Times New Roman"/>
                 <w:sz w:val="24"/>
                 <w:szCs w:val="24"/>
-                <w:shd w:val="clear" w:color="auto" w:fill="FF9900"/>
               </w:rPr>
               <w:t>protocol_date</w:t>
             </w:r>
+            <w:proofErr w:type="spellEnd"/>
             <w:r>
               <w:rPr>
                 <w:rFonts w:ascii="Times New Roman" w:eastAsia="Times New Roman" w:hAnsi="Times New Roman" w:cs="Times New Roman"/>
                 <w:sz w:val="24"/>
                 <w:szCs w:val="24"/>
-                <w:shd w:val="clear" w:color="auto" w:fill="FF9900"/>
               </w:rPr>
               <w:t>}}</w:t>
             </w:r>
@@ -214,7 +238,6 @@
                 <w:rFonts w:ascii="Times New Roman" w:eastAsia="Times New Roman" w:hAnsi="Times New Roman" w:cs="Times New Roman"/>
                 <w:sz w:val="24"/>
                 <w:szCs w:val="24"/>
-                <w:highlight w:val="yellow"/>
               </w:rPr>
             </w:pPr>
             <w:r>
@@ -272,56 +295,63 @@
           <w:sz w:val="24"/>
           <w:szCs w:val="24"/>
         </w:rPr>
-        <w:t xml:space="preserve">Розгляд звернення </w:t>
-      </w:r>
-      <w:r>
-        <w:rPr>
-          <w:rFonts w:ascii="Times New Roman" w:eastAsia="Times New Roman" w:hAnsi="Times New Roman" w:cs="Times New Roman"/>
-          <w:sz w:val="24"/>
-          <w:szCs w:val="24"/>
-        </w:rPr>
-        <w:t>{{ report_id }}</w:t>
-      </w:r>
-      <w:r>
-        <w:rPr>
-          <w:rFonts w:ascii="Times New Roman" w:eastAsia="Times New Roman" w:hAnsi="Times New Roman" w:cs="Times New Roman"/>
-          <w:sz w:val="24"/>
-          <w:szCs w:val="24"/>
-        </w:rPr>
-        <w:t xml:space="preserve"> від Замовника – </w:t>
-      </w:r>
-      <w:r>
-        <w:rPr>
-          <w:rFonts w:ascii="Times New Roman" w:eastAsia="Times New Roman" w:hAnsi="Times New Roman" w:cs="Times New Roman"/>
-          <w:sz w:val="24"/>
-          <w:szCs w:val="24"/>
-        </w:rPr>
-        <w:t>{{ customer_name_genitive }}</w:t>
-      </w:r>
-      <w:r>
-        <w:rPr>
-          <w:rFonts w:ascii="Times New Roman" w:eastAsia="Times New Roman" w:hAnsi="Times New Roman" w:cs="Times New Roman"/>
-          <w:sz w:val="24"/>
-          <w:szCs w:val="24"/>
-        </w:rPr>
-        <w:t xml:space="preserve"> (код ЄДРПОУ: </w:t>
-      </w:r>
-      <w:r>
-        <w:rPr>
-          <w:rFonts w:ascii="Times New Roman" w:eastAsia="Times New Roman" w:hAnsi="Times New Roman" w:cs="Times New Roman"/>
-          <w:sz w:val="24"/>
-          <w:szCs w:val="24"/>
-        </w:rPr>
-        <w:t>{{ customer_code }}</w:t>
-      </w:r>
-      <w:r>
-        <w:rPr>
-          <w:rFonts w:ascii="Times New Roman" w:eastAsia="Times New Roman" w:hAnsi="Times New Roman" w:cs="Times New Roman"/>
-          <w:sz w:val="24"/>
-          <w:szCs w:val="24"/>
-        </w:rPr>
-        <w:t>), стосовно закупівлі {{</w:t>
-      </w:r>
+        <w:t xml:space="preserve">Розгляд звернення {{ </w:t>
+      </w:r>
+      <w:proofErr w:type="spellStart"/>
+      <w:r>
+        <w:rPr>
+          <w:rFonts w:ascii="Times New Roman" w:eastAsia="Times New Roman" w:hAnsi="Times New Roman" w:cs="Times New Roman"/>
+          <w:sz w:val="24"/>
+          <w:szCs w:val="24"/>
+        </w:rPr>
+        <w:t>report_id</w:t>
+      </w:r>
+      <w:proofErr w:type="spellEnd"/>
+      <w:r>
+        <w:rPr>
+          <w:rFonts w:ascii="Times New Roman" w:eastAsia="Times New Roman" w:hAnsi="Times New Roman" w:cs="Times New Roman"/>
+          <w:sz w:val="24"/>
+          <w:szCs w:val="24"/>
+        </w:rPr>
+        <w:t xml:space="preserve"> }} від Замовника – {{ </w:t>
+      </w:r>
+      <w:proofErr w:type="spellStart"/>
+      <w:r>
+        <w:rPr>
+          <w:rFonts w:ascii="Times New Roman" w:eastAsia="Times New Roman" w:hAnsi="Times New Roman" w:cs="Times New Roman"/>
+          <w:sz w:val="24"/>
+          <w:szCs w:val="24"/>
+        </w:rPr>
+        <w:t>customer_name_genitive</w:t>
+      </w:r>
+      <w:proofErr w:type="spellEnd"/>
+      <w:r>
+        <w:rPr>
+          <w:rFonts w:ascii="Times New Roman" w:eastAsia="Times New Roman" w:hAnsi="Times New Roman" w:cs="Times New Roman"/>
+          <w:sz w:val="24"/>
+          <w:szCs w:val="24"/>
+        </w:rPr>
+        <w:t xml:space="preserve"> }} (код ЄДРПОУ: {{ </w:t>
+      </w:r>
+      <w:proofErr w:type="spellStart"/>
+      <w:r>
+        <w:rPr>
+          <w:rFonts w:ascii="Times New Roman" w:eastAsia="Times New Roman" w:hAnsi="Times New Roman" w:cs="Times New Roman"/>
+          <w:sz w:val="24"/>
+          <w:szCs w:val="24"/>
+        </w:rPr>
+        <w:t>customer_code</w:t>
+      </w:r>
+      <w:proofErr w:type="spellEnd"/>
+      <w:r>
+        <w:rPr>
+          <w:rFonts w:ascii="Times New Roman" w:eastAsia="Times New Roman" w:hAnsi="Times New Roman" w:cs="Times New Roman"/>
+          <w:sz w:val="24"/>
+          <w:szCs w:val="24"/>
+        </w:rPr>
+        <w:t xml:space="preserve"> }}), стосовно закупівлі {{</w:t>
+      </w:r>
+      <w:proofErr w:type="spellStart"/>
       <w:r>
         <w:rPr>
           <w:rFonts w:ascii="Times New Roman" w:eastAsia="Times New Roman" w:hAnsi="Times New Roman" w:cs="Times New Roman"/>
@@ -330,6 +360,7 @@
         </w:rPr>
         <w:t>procurement_id</w:t>
       </w:r>
+      <w:proofErr w:type="spellEnd"/>
       <w:r>
         <w:rPr>
           <w:rFonts w:ascii="Times New Roman" w:eastAsia="Times New Roman" w:hAnsi="Times New Roman" w:cs="Times New Roman"/>
@@ -352,23 +383,25 @@
           <w:sz w:val="24"/>
           <w:szCs w:val="24"/>
         </w:rPr>
-        <w:t xml:space="preserve">021:2015: </w:t>
-      </w:r>
-      <w:r>
-        <w:rPr>
-          <w:rFonts w:ascii="Times New Roman" w:eastAsia="Times New Roman" w:hAnsi="Times New Roman" w:cs="Times New Roman"/>
-          <w:sz w:val="24"/>
-          <w:szCs w:val="24"/>
-        </w:rPr>
-        <w:t>{{ cpv_category }}</w:t>
-      </w:r>
-      <w:r>
-        <w:rPr>
-          <w:rFonts w:ascii="Times New Roman" w:eastAsia="Times New Roman" w:hAnsi="Times New Roman" w:cs="Times New Roman"/>
-          <w:sz w:val="24"/>
-          <w:szCs w:val="24"/>
-        </w:rPr>
-        <w:t>).</w:t>
+        <w:t xml:space="preserve">021:2015: {{ </w:t>
+      </w:r>
+      <w:proofErr w:type="spellStart"/>
+      <w:r>
+        <w:rPr>
+          <w:rFonts w:ascii="Times New Roman" w:eastAsia="Times New Roman" w:hAnsi="Times New Roman" w:cs="Times New Roman"/>
+          <w:sz w:val="24"/>
+          <w:szCs w:val="24"/>
+        </w:rPr>
+        <w:t>cpv_category</w:t>
+      </w:r>
+      <w:proofErr w:type="spellEnd"/>
+      <w:r>
+        <w:rPr>
+          <w:rFonts w:ascii="Times New Roman" w:eastAsia="Times New Roman" w:hAnsi="Times New Roman" w:cs="Times New Roman"/>
+          <w:sz w:val="24"/>
+          <w:szCs w:val="24"/>
+        </w:rPr>
+        <w:t xml:space="preserve"> }}).</w:t>
       </w:r>
     </w:p>
     <w:p>
@@ -414,6 +447,7 @@
         </w:rPr>
         <w:t xml:space="preserve">Замовник закупівлі {{ </w:t>
       </w:r>
+      <w:proofErr w:type="spellStart"/>
       <w:r>
         <w:rPr>
           <w:rFonts w:ascii="Times New Roman" w:eastAsia="Times New Roman" w:hAnsi="Times New Roman" w:cs="Times New Roman"/>
@@ -422,61 +456,68 @@
         </w:rPr>
         <w:t>procurement_id</w:t>
       </w:r>
-      <w:r>
-        <w:rPr>
-          <w:rFonts w:ascii="Times New Roman" w:eastAsia="Times New Roman" w:hAnsi="Times New Roman" w:cs="Times New Roman"/>
-          <w:sz w:val="24"/>
-          <w:szCs w:val="24"/>
-        </w:rPr>
-        <w:t xml:space="preserve"> }} (далі – Закупівля) – </w:t>
-      </w:r>
-      <w:r>
-        <w:rPr>
-          <w:rFonts w:ascii="Times New Roman" w:eastAsia="Times New Roman" w:hAnsi="Times New Roman" w:cs="Times New Roman"/>
-          <w:sz w:val="24"/>
-          <w:szCs w:val="24"/>
-        </w:rPr>
-        <w:t>{{ customer_name }}</w:t>
-      </w:r>
-      <w:r>
-        <w:rPr>
-          <w:rFonts w:ascii="Times New Roman" w:eastAsia="Times New Roman" w:hAnsi="Times New Roman" w:cs="Times New Roman"/>
-          <w:sz w:val="24"/>
-          <w:szCs w:val="24"/>
-        </w:rPr>
-        <w:t xml:space="preserve"> (код ЄДРПОУ: </w:t>
-      </w:r>
-      <w:r>
-        <w:rPr>
-          <w:rFonts w:ascii="Times New Roman" w:eastAsia="Times New Roman" w:hAnsi="Times New Roman" w:cs="Times New Roman"/>
-          <w:sz w:val="24"/>
-          <w:szCs w:val="24"/>
-        </w:rPr>
-        <w:t>{{ customer_code }}</w:t>
-      </w:r>
-      <w:r>
-        <w:rPr>
-          <w:rFonts w:ascii="Times New Roman" w:eastAsia="Times New Roman" w:hAnsi="Times New Roman" w:cs="Times New Roman"/>
-          <w:sz w:val="24"/>
-          <w:szCs w:val="24"/>
-        </w:rPr>
-        <w:t xml:space="preserve">, далі – Замовник) </w:t>
-      </w:r>
-      <w:r>
-        <w:rPr>
-          <w:rFonts w:ascii="Times New Roman" w:eastAsia="Times New Roman" w:hAnsi="Times New Roman" w:cs="Times New Roman"/>
-          <w:sz w:val="24"/>
-          <w:szCs w:val="24"/>
-        </w:rPr>
-        <w:t>{{ procurement_date }}</w:t>
-      </w:r>
-      <w:r>
-        <w:rPr>
-          <w:rFonts w:ascii="Times New Roman" w:eastAsia="Times New Roman" w:hAnsi="Times New Roman" w:cs="Times New Roman"/>
-          <w:sz w:val="24"/>
-          <w:szCs w:val="24"/>
-        </w:rPr>
-        <w:t xml:space="preserve"> оголосив запит (ціни) пропозицій на предмет закупівлі: ДК</w:t>
+      <w:proofErr w:type="spellEnd"/>
+      <w:r>
+        <w:rPr>
+          <w:rFonts w:ascii="Times New Roman" w:eastAsia="Times New Roman" w:hAnsi="Times New Roman" w:cs="Times New Roman"/>
+          <w:sz w:val="24"/>
+          <w:szCs w:val="24"/>
+        </w:rPr>
+        <w:t xml:space="preserve"> }} (далі – Закупівля) – {{ </w:t>
+      </w:r>
+      <w:proofErr w:type="spellStart"/>
+      <w:r>
+        <w:rPr>
+          <w:rFonts w:ascii="Times New Roman" w:eastAsia="Times New Roman" w:hAnsi="Times New Roman" w:cs="Times New Roman"/>
+          <w:sz w:val="24"/>
+          <w:szCs w:val="24"/>
+        </w:rPr>
+        <w:t>customer_name</w:t>
+      </w:r>
+      <w:proofErr w:type="spellEnd"/>
+      <w:r>
+        <w:rPr>
+          <w:rFonts w:ascii="Times New Roman" w:eastAsia="Times New Roman" w:hAnsi="Times New Roman" w:cs="Times New Roman"/>
+          <w:sz w:val="24"/>
+          <w:szCs w:val="24"/>
+        </w:rPr>
+        <w:t xml:space="preserve"> }} (код ЄДРПОУ: {{ </w:t>
+      </w:r>
+      <w:proofErr w:type="spellStart"/>
+      <w:r>
+        <w:rPr>
+          <w:rFonts w:ascii="Times New Roman" w:eastAsia="Times New Roman" w:hAnsi="Times New Roman" w:cs="Times New Roman"/>
+          <w:sz w:val="24"/>
+          <w:szCs w:val="24"/>
+        </w:rPr>
+        <w:t>customer_code</w:t>
+      </w:r>
+      <w:proofErr w:type="spellEnd"/>
+      <w:r>
+        <w:rPr>
+          <w:rFonts w:ascii="Times New Roman" w:eastAsia="Times New Roman" w:hAnsi="Times New Roman" w:cs="Times New Roman"/>
+          <w:sz w:val="24"/>
+          <w:szCs w:val="24"/>
+        </w:rPr>
+        <w:t xml:space="preserve"> }}, далі – Замовник) {{ </w:t>
+      </w:r>
+      <w:proofErr w:type="spellStart"/>
+      <w:r>
+        <w:rPr>
+          <w:rFonts w:ascii="Times New Roman" w:eastAsia="Times New Roman" w:hAnsi="Times New Roman" w:cs="Times New Roman"/>
+          <w:sz w:val="24"/>
+          <w:szCs w:val="24"/>
+        </w:rPr>
+        <w:t>procurement_date</w:t>
+      </w:r>
+      <w:proofErr w:type="spellEnd"/>
+      <w:r>
+        <w:rPr>
+          <w:rFonts w:ascii="Times New Roman" w:eastAsia="Times New Roman" w:hAnsi="Times New Roman" w:cs="Times New Roman"/>
+          <w:sz w:val="24"/>
+          <w:szCs w:val="24"/>
+        </w:rPr>
+        <w:t xml:space="preserve"> }} оголосив запит (ціни) пропозицій на предмет закупівлі: ДК</w:t>
       </w:r>
       <w:r>
         <w:rPr>
@@ -492,23 +533,25 @@
           <w:sz w:val="24"/>
           <w:szCs w:val="24"/>
         </w:rPr>
-        <w:t xml:space="preserve">021:2015: </w:t>
-      </w:r>
-      <w:r>
-        <w:rPr>
-          <w:rFonts w:ascii="Times New Roman" w:eastAsia="Times New Roman" w:hAnsi="Times New Roman" w:cs="Times New Roman"/>
-          <w:sz w:val="24"/>
-          <w:szCs w:val="24"/>
-        </w:rPr>
-        <w:t>{{ cpv_category }}</w:t>
-      </w:r>
-      <w:r>
-        <w:rPr>
-          <w:rFonts w:ascii="Times New Roman" w:eastAsia="Times New Roman" w:hAnsi="Times New Roman" w:cs="Times New Roman"/>
-          <w:sz w:val="24"/>
-          <w:szCs w:val="24"/>
-        </w:rPr>
-        <w:t>.</w:t>
+        <w:t xml:space="preserve">021:2015: {{ </w:t>
+      </w:r>
+      <w:proofErr w:type="spellStart"/>
+      <w:r>
+        <w:rPr>
+          <w:rFonts w:ascii="Times New Roman" w:eastAsia="Times New Roman" w:hAnsi="Times New Roman" w:cs="Times New Roman"/>
+          <w:sz w:val="24"/>
+          <w:szCs w:val="24"/>
+        </w:rPr>
+        <w:t>cpv_category</w:t>
+      </w:r>
+      <w:proofErr w:type="spellEnd"/>
+      <w:r>
+        <w:rPr>
+          <w:rFonts w:ascii="Times New Roman" w:eastAsia="Times New Roman" w:hAnsi="Times New Roman" w:cs="Times New Roman"/>
+          <w:sz w:val="24"/>
+          <w:szCs w:val="24"/>
+        </w:rPr>
+        <w:t xml:space="preserve"> }}.</w:t>
       </w:r>
     </w:p>
     <w:p>
@@ -528,55 +571,61 @@
           <w:sz w:val="24"/>
           <w:szCs w:val="24"/>
         </w:rPr>
-        <w:t xml:space="preserve">Замовник стверджує, що учасник Закупівлі – </w:t>
-      </w:r>
-      <w:r>
-        <w:rPr>
-          <w:rFonts w:ascii="Times New Roman" w:eastAsia="Times New Roman" w:hAnsi="Times New Roman" w:cs="Times New Roman"/>
-          <w:sz w:val="24"/>
-          <w:szCs w:val="24"/>
-        </w:rPr>
-        <w:t>{{ supplier_name }}</w:t>
-      </w:r>
-      <w:r>
-        <w:rPr>
-          <w:rFonts w:ascii="Times New Roman" w:eastAsia="Times New Roman" w:hAnsi="Times New Roman" w:cs="Times New Roman"/>
-          <w:sz w:val="24"/>
-          <w:szCs w:val="24"/>
-        </w:rPr>
-        <w:t xml:space="preserve"> (</w:t>
-      </w:r>
-      <w:r>
-        <w:rPr>
-          <w:rFonts w:ascii="Times New Roman" w:eastAsia="Times New Roman" w:hAnsi="Times New Roman" w:cs="Times New Roman"/>
-          <w:sz w:val="24"/>
-          <w:szCs w:val="24"/>
-        </w:rPr>
-        <w:t>{{ supplier_code_label }}</w:t>
-      </w:r>
-      <w:r>
-        <w:rPr>
-          <w:rFonts w:ascii="Times New Roman" w:eastAsia="Times New Roman" w:hAnsi="Times New Roman" w:cs="Times New Roman"/>
-          <w:sz w:val="24"/>
-          <w:szCs w:val="24"/>
-        </w:rPr>
-        <w:t xml:space="preserve">: </w:t>
-      </w:r>
-      <w:r>
-        <w:rPr>
-          <w:rFonts w:ascii="Times New Roman" w:eastAsia="Times New Roman" w:hAnsi="Times New Roman" w:cs="Times New Roman"/>
-          <w:sz w:val="24"/>
-          <w:szCs w:val="24"/>
-        </w:rPr>
-        <w:t>{{ supplier_code }}</w:t>
-      </w:r>
-      <w:r>
-        <w:rPr>
-          <w:rFonts w:ascii="Times New Roman" w:eastAsia="Times New Roman" w:hAnsi="Times New Roman" w:cs="Times New Roman"/>
-          <w:sz w:val="24"/>
-          <w:szCs w:val="24"/>
-        </w:rPr>
-        <w:t>, далі – Постачальник), допустив наступне порушення:</w:t>
+        <w:t xml:space="preserve">Замовник стверджує, що учасник Закупівлі – {{ </w:t>
+      </w:r>
+      <w:proofErr w:type="spellStart"/>
+      <w:r>
+        <w:rPr>
+          <w:rFonts w:ascii="Times New Roman" w:eastAsia="Times New Roman" w:hAnsi="Times New Roman" w:cs="Times New Roman"/>
+          <w:sz w:val="24"/>
+          <w:szCs w:val="24"/>
+        </w:rPr>
+        <w:t>supplier_name</w:t>
+      </w:r>
+      <w:proofErr w:type="spellEnd"/>
+      <w:r>
+        <w:rPr>
+          <w:rFonts w:ascii="Times New Roman" w:eastAsia="Times New Roman" w:hAnsi="Times New Roman" w:cs="Times New Roman"/>
+          <w:sz w:val="24"/>
+          <w:szCs w:val="24"/>
+        </w:rPr>
+        <w:t xml:space="preserve"> }} ({{ </w:t>
+      </w:r>
+      <w:proofErr w:type="spellStart"/>
+      <w:r>
+        <w:rPr>
+          <w:rFonts w:ascii="Times New Roman" w:eastAsia="Times New Roman" w:hAnsi="Times New Roman" w:cs="Times New Roman"/>
+          <w:sz w:val="24"/>
+          <w:szCs w:val="24"/>
+        </w:rPr>
+        <w:t>supplier_code_label</w:t>
+      </w:r>
+      <w:proofErr w:type="spellEnd"/>
+      <w:r>
+        <w:rPr>
+          <w:rFonts w:ascii="Times New Roman" w:eastAsia="Times New Roman" w:hAnsi="Times New Roman" w:cs="Times New Roman"/>
+          <w:sz w:val="24"/>
+          <w:szCs w:val="24"/>
+        </w:rPr>
+        <w:t xml:space="preserve"> }}: {{ </w:t>
+      </w:r>
+      <w:proofErr w:type="spellStart"/>
+      <w:r>
+        <w:rPr>
+          <w:rFonts w:ascii="Times New Roman" w:eastAsia="Times New Roman" w:hAnsi="Times New Roman" w:cs="Times New Roman"/>
+          <w:sz w:val="24"/>
+          <w:szCs w:val="24"/>
+        </w:rPr>
+        <w:t>supplier_code</w:t>
+      </w:r>
+      <w:proofErr w:type="spellEnd"/>
+      <w:r>
+        <w:rPr>
+          <w:rFonts w:ascii="Times New Roman" w:eastAsia="Times New Roman" w:hAnsi="Times New Roman" w:cs="Times New Roman"/>
+          <w:sz w:val="24"/>
+          <w:szCs w:val="24"/>
+        </w:rPr>
+        <w:t xml:space="preserve"> }}, далі – Постачальник), допустив наступне порушення:</w:t>
       </w:r>
     </w:p>
     <w:p>
@@ -683,7 +732,29 @@
                 <w:sz w:val="20"/>
                 <w:szCs w:val="20"/>
               </w:rPr>
-              <w:t>{{ reason_label }}</w:t>
+              <w:t xml:space="preserve">{{ </w:t>
+            </w:r>
+            <w:proofErr w:type="spellStart"/>
+            <w:r>
+              <w:rPr>
+                <w:rFonts w:ascii="Times New Roman" w:eastAsia="Times New Roman" w:hAnsi="Times New Roman" w:cs="Times New Roman"/>
+                <w:b/>
+                <w:bCs/>
+                <w:sz w:val="20"/>
+                <w:szCs w:val="20"/>
+              </w:rPr>
+              <w:t>reason_label</w:t>
+            </w:r>
+            <w:proofErr w:type="spellEnd"/>
+            <w:r>
+              <w:rPr>
+                <w:rFonts w:ascii="Times New Roman" w:eastAsia="Times New Roman" w:hAnsi="Times New Roman" w:cs="Times New Roman"/>
+                <w:b/>
+                <w:bCs/>
+                <w:sz w:val="20"/>
+                <w:szCs w:val="20"/>
+              </w:rPr>
+              <w:t xml:space="preserve"> }}</w:t>
             </w:r>
           </w:p>
           <w:p>
@@ -702,7 +773,25 @@
                 <w:sz w:val="20"/>
                 <w:szCs w:val="20"/>
               </w:rPr>
-              <w:t>{{ reason_text }}</w:t>
+              <w:t xml:space="preserve">{{ </w:t>
+            </w:r>
+            <w:proofErr w:type="spellStart"/>
+            <w:r>
+              <w:rPr>
+                <w:rFonts w:ascii="Times New Roman" w:eastAsia="Times New Roman" w:hAnsi="Times New Roman" w:cs="Times New Roman"/>
+                <w:sz w:val="20"/>
+                <w:szCs w:val="20"/>
+              </w:rPr>
+              <w:t>reason_text</w:t>
+            </w:r>
+            <w:proofErr w:type="spellEnd"/>
+            <w:r>
+              <w:rPr>
+                <w:rFonts w:ascii="Times New Roman" w:eastAsia="Times New Roman" w:hAnsi="Times New Roman" w:cs="Times New Roman"/>
+                <w:sz w:val="20"/>
+                <w:szCs w:val="20"/>
+              </w:rPr>
+              <w:t xml:space="preserve"> }}</w:t>
             </w:r>
           </w:p>
         </w:tc>
@@ -745,8 +834,9 @@
                 <w:sz w:val="20"/>
                 <w:szCs w:val="20"/>
               </w:rPr>
-              <w:t>«</w:t>
-            </w:r>
+              <w:t>«{{</w:t>
+            </w:r>
+            <w:proofErr w:type="spellStart"/>
             <w:r>
               <w:rPr>
                 <w:rFonts w:ascii="Times New Roman" w:eastAsia="Times New Roman" w:hAnsi="Times New Roman" w:cs="Times New Roman"/>
@@ -755,8 +845,9 @@
                 <w:sz w:val="20"/>
                 <w:szCs w:val="20"/>
               </w:rPr>
-              <w:t>{{violation_description }}</w:t>
-            </w:r>
+              <w:t>violation_description</w:t>
+            </w:r>
+            <w:proofErr w:type="spellEnd"/>
             <w:r>
               <w:rPr>
                 <w:rFonts w:ascii="Times New Roman" w:eastAsia="Times New Roman" w:hAnsi="Times New Roman" w:cs="Times New Roman"/>
@@ -765,7 +856,7 @@
                 <w:sz w:val="20"/>
                 <w:szCs w:val="20"/>
               </w:rPr>
-              <w:t>»</w:t>
+              <w:t xml:space="preserve"> }}»</w:t>
             </w:r>
           </w:p>
         </w:tc>
@@ -828,7 +919,6 @@
                 <w:iCs/>
                 <w:sz w:val="20"/>
                 <w:szCs w:val="20"/>
-                <w:highlight w:val="cyan"/>
               </w:rPr>
             </w:pPr>
             <w:r>
@@ -838,7 +928,6 @@
                 <w:iCs/>
                 <w:sz w:val="20"/>
                 <w:szCs w:val="20"/>
-                <w:highlight w:val="cyan"/>
               </w:rPr>
               <w:t xml:space="preserve">До звернення Замовником додано файл, який </w:t>
             </w:r>
@@ -851,7 +940,6 @@
                 <w:iCs/>
                 <w:sz w:val="20"/>
                 <w:szCs w:val="20"/>
-                <w:highlight w:val="cyan"/>
               </w:rPr>
               <w:t>є технічно пошкодженим та має нульовий розмір (0 байт)</w:t>
             </w:r>
@@ -862,7 +950,6 @@
                 <w:iCs/>
                 <w:sz w:val="20"/>
                 <w:szCs w:val="20"/>
-                <w:highlight w:val="cyan"/>
               </w:rPr>
               <w:t>, що унеможливлює ознайомлення з його змістом:</w:t>
             </w:r>
@@ -877,7 +964,6 @@
                 <w:iCs/>
                 <w:sz w:val="20"/>
                 <w:szCs w:val="20"/>
-                <w:highlight w:val="cyan"/>
               </w:rPr>
             </w:pPr>
           </w:p>
@@ -891,7 +977,6 @@
                 <w:iCs/>
                 <w:sz w:val="20"/>
                 <w:szCs w:val="20"/>
-                <w:highlight w:val="cyan"/>
               </w:rPr>
             </w:pPr>
             <w:r>
@@ -901,7 +986,6 @@
                 <w:iCs/>
                 <w:sz w:val="20"/>
                 <w:szCs w:val="20"/>
-                <w:highlight w:val="cyan"/>
               </w:rPr>
               <w:t xml:space="preserve">До звернення Замовником додані файли, які </w:t>
             </w:r>
@@ -914,7 +998,6 @@
                 <w:iCs/>
                 <w:sz w:val="20"/>
                 <w:szCs w:val="20"/>
-                <w:highlight w:val="cyan"/>
               </w:rPr>
               <w:t>є технічно пошкодженими та мають нульовий розмір (0 байт)</w:t>
             </w:r>
@@ -925,7 +1008,6 @@
                 <w:iCs/>
                 <w:sz w:val="20"/>
                 <w:szCs w:val="20"/>
-                <w:highlight w:val="cyan"/>
               </w:rPr>
               <w:t>, що унеможливлює ознайомлення з їх змістом:</w:t>
             </w:r>
@@ -964,9 +1046,30 @@
                 <w:iCs/>
                 <w:sz w:val="20"/>
                 <w:szCs w:val="20"/>
-                <w:shd w:val="clear" w:color="auto" w:fill="FF9900"/>
-              </w:rPr>
-              <w:t>{{ customer_documents }}</w:t>
+              </w:rPr>
+              <w:t xml:space="preserve">{{ </w:t>
+            </w:r>
+            <w:proofErr w:type="spellStart"/>
+            <w:r>
+              <w:rPr>
+                <w:rFonts w:ascii="Times New Roman" w:eastAsia="Times New Roman" w:hAnsi="Times New Roman" w:cs="Times New Roman"/>
+                <w:i/>
+                <w:iCs/>
+                <w:sz w:val="20"/>
+                <w:szCs w:val="20"/>
+              </w:rPr>
+              <w:t>customer_documents</w:t>
+            </w:r>
+            <w:proofErr w:type="spellEnd"/>
+            <w:r>
+              <w:rPr>
+                <w:rFonts w:ascii="Times New Roman" w:eastAsia="Times New Roman" w:hAnsi="Times New Roman" w:cs="Times New Roman"/>
+                <w:i/>
+                <w:iCs/>
+                <w:sz w:val="20"/>
+                <w:szCs w:val="20"/>
+              </w:rPr>
+              <w:t xml:space="preserve"> }}</w:t>
             </w:r>
           </w:p>
         </w:tc>
@@ -1039,8 +1142,9 @@
                 <w:sz w:val="20"/>
                 <w:szCs w:val="20"/>
               </w:rPr>
-              <w:t xml:space="preserve">до </w:t>
-            </w:r>
+              <w:t xml:space="preserve">до {{ </w:t>
+            </w:r>
+            <w:proofErr w:type="spellStart"/>
             <w:r>
               <w:rPr>
                 <w:rFonts w:ascii="Times New Roman" w:eastAsia="Times New Roman" w:hAnsi="Times New Roman" w:cs="Times New Roman"/>
@@ -1049,7 +1153,18 @@
                 <w:sz w:val="20"/>
                 <w:szCs w:val="20"/>
               </w:rPr>
-              <w:t>{{ supplier_deadline }}</w:t>
+              <w:t>supplier_deadline</w:t>
+            </w:r>
+            <w:proofErr w:type="spellEnd"/>
+            <w:r>
+              <w:rPr>
+                <w:rFonts w:ascii="Times New Roman" w:eastAsia="Times New Roman" w:hAnsi="Times New Roman" w:cs="Times New Roman"/>
+                <w:i/>
+                <w:iCs/>
+                <w:sz w:val="20"/>
+                <w:szCs w:val="20"/>
+              </w:rPr>
+              <w:t xml:space="preserve"> }}</w:t>
             </w:r>
           </w:p>
         </w:tc>
@@ -1064,7 +1179,6 @@
           <w:right w:val="none" w:sz="0" w:space="0" w:color="000000"/>
           <w:between w:val="none" w:sz="0" w:space="0" w:color="000000"/>
         </w:pBdr>
-        <w:shd w:val="clear" w:color="auto" w:fill="FFFFFF"/>
         <w:tabs>
           <w:tab w:val="left" w:pos="993"/>
         </w:tabs>
@@ -1095,7 +1209,6 @@
           <w:right w:val="none" w:sz="0" w:space="0" w:color="000000"/>
           <w:between w:val="none" w:sz="0" w:space="0" w:color="000000"/>
         </w:pBdr>
-        <w:shd w:val="clear" w:color="auto" w:fill="FFFFFF"/>
         <w:tabs>
           <w:tab w:val="left" w:pos="993"/>
         </w:tabs>
@@ -1132,7 +1245,25 @@
           <w:sz w:val="24"/>
           <w:szCs w:val="24"/>
         </w:rPr>
-        <w:t xml:space="preserve"> на умовах, визначених замовником у запиті пропозицій постачальників шляхом заповнення електронних форм з окремими полями та у проекті договору, що є складовою частиною запиту пропозицій постачальників, </w:t>
+        <w:t xml:space="preserve"> на умовах, визначених замовником у запиті пропозицій постачальників шляхом заповнення електронних форм з окремими полями та у </w:t>
+      </w:r>
+      <w:proofErr w:type="spellStart"/>
+      <w:r>
+        <w:rPr>
+          <w:rFonts w:ascii="Times New Roman" w:eastAsia="Times New Roman" w:hAnsi="Times New Roman" w:cs="Times New Roman"/>
+          <w:sz w:val="24"/>
+          <w:szCs w:val="24"/>
+        </w:rPr>
+        <w:t>проекті</w:t>
+      </w:r>
+      <w:proofErr w:type="spellEnd"/>
+      <w:r>
+        <w:rPr>
+          <w:rFonts w:ascii="Times New Roman" w:eastAsia="Times New Roman" w:hAnsi="Times New Roman" w:cs="Times New Roman"/>
+          <w:sz w:val="24"/>
+          <w:szCs w:val="24"/>
+        </w:rPr>
+        <w:t xml:space="preserve"> договору, що є складовою частиною запиту пропозицій постачальників, </w:t>
       </w:r>
       <w:r>
         <w:rPr>
@@ -1180,7 +1311,6 @@
           <w:right w:val="none" w:sz="0" w:space="0" w:color="000000"/>
           <w:between w:val="none" w:sz="0" w:space="0" w:color="000000"/>
         </w:pBdr>
-        <w:shd w:val="clear" w:color="auto" w:fill="FFFFFF"/>
         <w:tabs>
           <w:tab w:val="left" w:pos="993"/>
         </w:tabs>
@@ -1217,7 +1347,25 @@
           <w:sz w:val="24"/>
           <w:szCs w:val="24"/>
         </w:rPr>
-        <w:t xml:space="preserve"> на умовах, визначених замовником у запиті пропозицій постачальників шляхом заповнення електронних форм з окремими полями та у проекті договору, що є складовою частиною запиту пропозицій постачальників, </w:t>
+        <w:t xml:space="preserve"> на умовах, визначених замовником у запиті пропозицій постачальників шляхом заповнення електронних форм з окремими полями та у </w:t>
+      </w:r>
+      <w:proofErr w:type="spellStart"/>
+      <w:r>
+        <w:rPr>
+          <w:rFonts w:ascii="Times New Roman" w:eastAsia="Times New Roman" w:hAnsi="Times New Roman" w:cs="Times New Roman"/>
+          <w:sz w:val="24"/>
+          <w:szCs w:val="24"/>
+        </w:rPr>
+        <w:t>проекті</w:t>
+      </w:r>
+      <w:proofErr w:type="spellEnd"/>
+      <w:r>
+        <w:rPr>
+          <w:rFonts w:ascii="Times New Roman" w:eastAsia="Times New Roman" w:hAnsi="Times New Roman" w:cs="Times New Roman"/>
+          <w:sz w:val="24"/>
+          <w:szCs w:val="24"/>
+        </w:rPr>
+        <w:t xml:space="preserve"> договору, що є складовою частиною запиту пропозицій постачальників, </w:t>
       </w:r>
       <w:r>
         <w:rPr>
@@ -1247,7 +1395,6 @@
           <w:right w:val="none" w:sz="0" w:space="0" w:color="000000"/>
           <w:between w:val="none" w:sz="0" w:space="0" w:color="000000"/>
         </w:pBdr>
-        <w:shd w:val="clear" w:color="auto" w:fill="FFFFFF"/>
         <w:tabs>
           <w:tab w:val="left" w:pos="993"/>
         </w:tabs>
@@ -1305,7 +1452,6 @@
           <w:right w:val="none" w:sz="0" w:space="0" w:color="000000"/>
           <w:between w:val="none" w:sz="0" w:space="0" w:color="000000"/>
         </w:pBdr>
-        <w:shd w:val="clear" w:color="auto" w:fill="FFFFFF"/>
         <w:tabs>
           <w:tab w:val="left" w:pos="993"/>
         </w:tabs>
@@ -1336,7 +1482,6 @@
           <w:right w:val="none" w:sz="0" w:space="0" w:color="000000"/>
           <w:between w:val="none" w:sz="0" w:space="0" w:color="000000"/>
         </w:pBdr>
-        <w:shd w:val="clear" w:color="auto" w:fill="FFFFFF"/>
         <w:tabs>
           <w:tab w:val="left" w:pos="993"/>
         </w:tabs>
@@ -1395,7 +1540,6 @@
           <w:right w:val="none" w:sz="0" w:space="0" w:color="000000"/>
           <w:between w:val="none" w:sz="0" w:space="0" w:color="000000"/>
         </w:pBdr>
-        <w:shd w:val="clear" w:color="auto" w:fill="FFFFFF"/>
         <w:tabs>
           <w:tab w:val="left" w:pos="993"/>
         </w:tabs>
@@ -1431,7 +1575,43 @@
           <w:sz w:val="24"/>
           <w:szCs w:val="24"/>
         </w:rPr>
-        <w:t>. У разі обґрунтованої потреби строк для укладення договору може бути продовжений до 10 календарних днів. При цьому договір між замовником та переможцем відбору укладається відповідно до вимог законодавства. Умови договору не можуть відрізнятися від умов, визначених замовником у запиті пропозицій постачальників шляхом заповнення електронних форм з окремими полями та у проекті договору, що є складовою частиною запиту пропозицій постачальників, та/або пропозиції переможця відбору, крім випадку зменшення ціни договору без зміни обсягу або перерахунку ціни та обсягів товарів у бік зменшення за умови необхідності приведення обсягів товарів до кратності упаковки, або приведення умов договору у відповідність з умовами, визначеними у запиті пропозицій постачальників шляхом заповнення електронних форм з окремими полями в електронній системі закупівель, якщо такі умови відрізняються у проекті договору. Договір може містити вимоги щодо забезпечення його виконання.</w:t>
+        <w:t xml:space="preserve">. У разі обґрунтованої потреби строк для укладення договору може бути продовжений до 10 календарних днів. При цьому договір між замовником та переможцем відбору укладається відповідно до вимог законодавства. Умови договору не можуть відрізнятися від умов, визначених замовником у запиті пропозицій постачальників шляхом заповнення електронних форм з окремими полями та у </w:t>
+      </w:r>
+      <w:proofErr w:type="spellStart"/>
+      <w:r>
+        <w:rPr>
+          <w:rFonts w:ascii="Times New Roman" w:eastAsia="Times New Roman" w:hAnsi="Times New Roman" w:cs="Times New Roman"/>
+          <w:sz w:val="24"/>
+          <w:szCs w:val="24"/>
+        </w:rPr>
+        <w:t>проекті</w:t>
+      </w:r>
+      <w:proofErr w:type="spellEnd"/>
+      <w:r>
+        <w:rPr>
+          <w:rFonts w:ascii="Times New Roman" w:eastAsia="Times New Roman" w:hAnsi="Times New Roman" w:cs="Times New Roman"/>
+          <w:sz w:val="24"/>
+          <w:szCs w:val="24"/>
+        </w:rPr>
+        <w:t xml:space="preserve"> договору, що є складовою частиною запиту пропозицій постачальників, та/або пропозиції переможця відбору, крім випадку зменшення ціни договору без зміни обсягу або перерахунку ціни та обсягів товарів у бік зменшення за умови необхідності приведення обсягів товарів до кратності упаковки, або приведення умов договору у відповідність з умовами, визначеними у запиті пропозицій постачальників шляхом заповнення електронних форм з окремими полями в електронній системі закупівель, якщо такі умови відрізняються у </w:t>
+      </w:r>
+      <w:proofErr w:type="spellStart"/>
+      <w:r>
+        <w:rPr>
+          <w:rFonts w:ascii="Times New Roman" w:eastAsia="Times New Roman" w:hAnsi="Times New Roman" w:cs="Times New Roman"/>
+          <w:sz w:val="24"/>
+          <w:szCs w:val="24"/>
+        </w:rPr>
+        <w:t>проекті</w:t>
+      </w:r>
+      <w:proofErr w:type="spellEnd"/>
+      <w:r>
+        <w:rPr>
+          <w:rFonts w:ascii="Times New Roman" w:eastAsia="Times New Roman" w:hAnsi="Times New Roman" w:cs="Times New Roman"/>
+          <w:sz w:val="24"/>
+          <w:szCs w:val="24"/>
+        </w:rPr>
+        <w:t xml:space="preserve"> договору. Договір може містити вимоги щодо забезпечення його виконання.</w:t>
       </w:r>
     </w:p>
     <w:p>
@@ -1443,7 +1623,6 @@
           <w:right w:val="none" w:sz="0" w:space="0" w:color="000000"/>
           <w:between w:val="none" w:sz="0" w:space="0" w:color="000000"/>
         </w:pBdr>
-        <w:shd w:val="clear" w:color="auto" w:fill="FFFFFF"/>
         <w:tabs>
           <w:tab w:val="left" w:pos="993"/>
         </w:tabs>
@@ -1471,7 +1650,43 @@
           <w:sz w:val="24"/>
           <w:szCs w:val="24"/>
         </w:rPr>
-        <w:t xml:space="preserve"> 1) не підписав договір на умовах, визначених замовником у запиті пропозицій постачальників, шляхом заповнення електронних форм з окремими полями, та у проекті договору, що є складовою частиною запиту пропозицій постачальників у строк, визначений пунктом 66 цього Порядку; 2) не надав забезпечення виконання договору у строк, визначений пунктом 66 цього Порядку; 3) письмово відмовився від укладення договору на умовах, визначених замовником у запиті пропозицій постачальників, шляхом заповнення електронних форм з окремими полями, та у проекті договору, що є складовою частиною запиту пропозицій постачальників.</w:t>
+        <w:t xml:space="preserve"> 1) не підписав договір на умовах, визначених замовником у запиті пропозицій постачальників, шляхом заповнення електронних форм з окремими полями, та у </w:t>
+      </w:r>
+      <w:proofErr w:type="spellStart"/>
+      <w:r>
+        <w:rPr>
+          <w:rFonts w:ascii="Times New Roman" w:eastAsia="Times New Roman" w:hAnsi="Times New Roman" w:cs="Times New Roman"/>
+          <w:sz w:val="24"/>
+          <w:szCs w:val="24"/>
+        </w:rPr>
+        <w:t>проекті</w:t>
+      </w:r>
+      <w:proofErr w:type="spellEnd"/>
+      <w:r>
+        <w:rPr>
+          <w:rFonts w:ascii="Times New Roman" w:eastAsia="Times New Roman" w:hAnsi="Times New Roman" w:cs="Times New Roman"/>
+          <w:sz w:val="24"/>
+          <w:szCs w:val="24"/>
+        </w:rPr>
+        <w:t xml:space="preserve"> договору, що є складовою частиною запиту пропозицій постачальників у строк, визначений пунктом 66 цього Порядку; 2) не надав забезпечення виконання договору у строк, визначений пунктом 66 цього Порядку; 3) письмово відмовився від укладення договору на умовах, визначених замовником у запиті пропозицій постачальників, шляхом заповнення електронних форм з окремими полями, та у </w:t>
+      </w:r>
+      <w:proofErr w:type="spellStart"/>
+      <w:r>
+        <w:rPr>
+          <w:rFonts w:ascii="Times New Roman" w:eastAsia="Times New Roman" w:hAnsi="Times New Roman" w:cs="Times New Roman"/>
+          <w:sz w:val="24"/>
+          <w:szCs w:val="24"/>
+        </w:rPr>
+        <w:t>проекті</w:t>
+      </w:r>
+      <w:proofErr w:type="spellEnd"/>
+      <w:r>
+        <w:rPr>
+          <w:rFonts w:ascii="Times New Roman" w:eastAsia="Times New Roman" w:hAnsi="Times New Roman" w:cs="Times New Roman"/>
+          <w:sz w:val="24"/>
+          <w:szCs w:val="24"/>
+        </w:rPr>
+        <w:t xml:space="preserve"> договору, що є складовою частиною запиту пропозицій постачальників.</w:t>
       </w:r>
     </w:p>
     <w:p>
@@ -1486,178 +1701,16 @@
           <w:rFonts w:ascii="Times New Roman" w:eastAsia="Times New Roman" w:hAnsi="Times New Roman" w:cs="Times New Roman"/>
           <w:sz w:val="24"/>
           <w:szCs w:val="24"/>
-          <w:shd w:val="clear" w:color="auto" w:fill="C9DAF8"/>
-        </w:rPr>
-      </w:pPr>
-      <w:r>
-        <w:rPr>
-          <w:rFonts w:ascii="Times New Roman" w:eastAsia="Times New Roman" w:hAnsi="Times New Roman" w:cs="Times New Roman"/>
-          <w:sz w:val="24"/>
-          <w:szCs w:val="24"/>
-          <w:shd w:val="clear" w:color="auto" w:fill="C9DAF8"/>
-        </w:rPr>
-        <w:t>Відповідно до роз’яснень Міністерства економіки України, що опубліковані за посиланнями:</w:t>
-      </w:r>
-      <w:hyperlink r:id="rId5">
-        <w:r>
-          <w:rPr>
-            <w:rFonts w:ascii="Times New Roman" w:eastAsia="Times New Roman" w:hAnsi="Times New Roman" w:cs="Times New Roman"/>
-            <w:color w:val="1155CC"/>
-            <w:sz w:val="24"/>
-            <w:szCs w:val="24"/>
-            <w:shd w:val="clear" w:color="auto" w:fill="C9DAF8"/>
-          </w:rPr>
-          <w:t xml:space="preserve"> </w:t>
-        </w:r>
-      </w:hyperlink>
-      <w:hyperlink r:id="rId6">
-        <w:r>
-          <w:rPr>
-            <w:rFonts w:ascii="Times New Roman" w:eastAsia="Times New Roman" w:hAnsi="Times New Roman" w:cs="Times New Roman"/>
-            <w:color w:val="1155CC"/>
-            <w:sz w:val="24"/>
-            <w:szCs w:val="24"/>
-            <w:u w:val="single"/>
-            <w:shd w:val="clear" w:color="auto" w:fill="C9DAF8"/>
-          </w:rPr>
-          <w:t>https://www.me.gov.ua/InfoRez/Details?id=3d8b5293-1542-45e7-8cab-60768b9ecc09&amp;lang=uk-UA</w:t>
-        </w:r>
-      </w:hyperlink>
-      <w:r>
-        <w:rPr>
-          <w:rFonts w:ascii="Times New Roman" w:eastAsia="Times New Roman" w:hAnsi="Times New Roman" w:cs="Times New Roman"/>
-          <w:sz w:val="24"/>
-          <w:szCs w:val="24"/>
-          <w:shd w:val="clear" w:color="auto" w:fill="C9DAF8"/>
-        </w:rPr>
-        <w:t>,</w:t>
-      </w:r>
-      <w:hyperlink r:id="rId7">
-        <w:r>
-          <w:rPr>
-            <w:rFonts w:ascii="Times New Roman" w:eastAsia="Times New Roman" w:hAnsi="Times New Roman" w:cs="Times New Roman"/>
-            <w:color w:val="1155CC"/>
-            <w:sz w:val="24"/>
-            <w:szCs w:val="24"/>
-            <w:shd w:val="clear" w:color="auto" w:fill="C9DAF8"/>
-          </w:rPr>
-          <w:t xml:space="preserve"> </w:t>
-        </w:r>
-      </w:hyperlink>
-      <w:hyperlink r:id="rId8">
-        <w:r>
-          <w:rPr>
-            <w:rFonts w:ascii="Times New Roman" w:eastAsia="Times New Roman" w:hAnsi="Times New Roman" w:cs="Times New Roman"/>
-            <w:color w:val="1155CC"/>
-            <w:sz w:val="24"/>
-            <w:szCs w:val="24"/>
-            <w:u w:val="single"/>
-            <w:shd w:val="clear" w:color="auto" w:fill="C9DAF8"/>
-          </w:rPr>
-          <w:t>https://me.gov.ua/InfoRez/Details?id=1c50d66b-a34f-4b83-8ae3-e1fdea208d80&amp;lang=uk-UA</w:t>
-        </w:r>
-      </w:hyperlink>
-      <w:r>
-        <w:rPr>
-          <w:rFonts w:ascii="Times New Roman" w:eastAsia="Times New Roman" w:hAnsi="Times New Roman" w:cs="Times New Roman"/>
-          <w:sz w:val="24"/>
-          <w:szCs w:val="24"/>
-          <w:shd w:val="clear" w:color="auto" w:fill="C9DAF8"/>
-        </w:rPr>
-        <w:t>,</w:t>
-      </w:r>
-      <w:hyperlink r:id="rId9">
-        <w:r>
-          <w:rPr>
-            <w:rFonts w:ascii="Times New Roman" w:eastAsia="Times New Roman" w:hAnsi="Times New Roman" w:cs="Times New Roman"/>
-            <w:color w:val="1155CC"/>
-            <w:sz w:val="24"/>
-            <w:szCs w:val="24"/>
-            <w:shd w:val="clear" w:color="auto" w:fill="C9DAF8"/>
-          </w:rPr>
-          <w:t xml:space="preserve"> </w:t>
-        </w:r>
-      </w:hyperlink>
-      <w:hyperlink r:id="rId10">
-        <w:r>
-          <w:rPr>
-            <w:rFonts w:ascii="Times New Roman" w:eastAsia="Times New Roman" w:hAnsi="Times New Roman" w:cs="Times New Roman"/>
-            <w:color w:val="1155CC"/>
-            <w:sz w:val="24"/>
-            <w:szCs w:val="24"/>
-            <w:u w:val="single"/>
-            <w:shd w:val="clear" w:color="auto" w:fill="C9DAF8"/>
-          </w:rPr>
-          <w:t>https://me.gov.ua/InfoRez/Details?id=011d5df6-768e-46e9-9f66-86a71737584d&amp;lang=uk-UA</w:t>
-        </w:r>
-      </w:hyperlink>
-      <w:r>
-        <w:rPr>
-          <w:rFonts w:ascii="Times New Roman" w:eastAsia="Times New Roman" w:hAnsi="Times New Roman" w:cs="Times New Roman"/>
-          <w:sz w:val="24"/>
-          <w:szCs w:val="24"/>
-          <w:shd w:val="clear" w:color="auto" w:fill="C9DAF8"/>
-        </w:rPr>
-        <w:t>, Закон України «Про публічні закупівлі» (далі – Закон) визначає правові та економічні засади здійснення закупівель товарів, робіт і послуг для забезпечення потреб держави, територіальних громад та об’єднаних територіальних громад. При цьому відповідно до ч.</w:t>
-      </w:r>
-      <w:r>
-        <w:rPr>
-          <w:rFonts w:ascii="Times New Roman" w:eastAsia="Times New Roman" w:hAnsi="Times New Roman" w:cs="Times New Roman"/>
-          <w:b/>
-          <w:bCs/>
-          <w:sz w:val="24"/>
-          <w:szCs w:val="24"/>
-          <w:shd w:val="clear" w:color="auto" w:fill="C9DAF8"/>
-        </w:rPr>
-        <w:t> </w:t>
-      </w:r>
-      <w:r>
-        <w:rPr>
-          <w:rFonts w:ascii="Times New Roman" w:eastAsia="Times New Roman" w:hAnsi="Times New Roman" w:cs="Times New Roman"/>
-          <w:sz w:val="24"/>
-          <w:szCs w:val="24"/>
-          <w:shd w:val="clear" w:color="auto" w:fill="C9DAF8"/>
-        </w:rPr>
-        <w:t>1 ст.</w:t>
-      </w:r>
-      <w:r>
-        <w:rPr>
-          <w:rFonts w:ascii="Times New Roman" w:eastAsia="Times New Roman" w:hAnsi="Times New Roman" w:cs="Times New Roman"/>
-          <w:b/>
-          <w:bCs/>
-          <w:sz w:val="24"/>
-          <w:szCs w:val="24"/>
-          <w:shd w:val="clear" w:color="auto" w:fill="C9DAF8"/>
-        </w:rPr>
-        <w:t> </w:t>
-      </w:r>
-      <w:r>
-        <w:rPr>
-          <w:rFonts w:ascii="Times New Roman" w:eastAsia="Times New Roman" w:hAnsi="Times New Roman" w:cs="Times New Roman"/>
-          <w:sz w:val="24"/>
-          <w:szCs w:val="24"/>
-          <w:shd w:val="clear" w:color="auto" w:fill="C9DAF8"/>
-        </w:rPr>
-        <w:t xml:space="preserve">253 Цивільного кодексу України </w:t>
-      </w:r>
-      <w:r>
-        <w:rPr>
-          <w:rFonts w:ascii="Times New Roman" w:eastAsia="Times New Roman" w:hAnsi="Times New Roman" w:cs="Times New Roman"/>
-          <w:sz w:val="24"/>
-          <w:szCs w:val="24"/>
-          <w:u w:val="single"/>
-          <w:shd w:val="clear" w:color="auto" w:fill="C9DAF8"/>
-        </w:rPr>
-        <w:t>перебіг строку починається з наступного дня після відповідної календарної дати або настання події, з якою пов’язано його початок</w:t>
-      </w:r>
-      <w:r>
-        <w:rPr>
-          <w:rFonts w:ascii="Times New Roman" w:eastAsia="Times New Roman" w:hAnsi="Times New Roman" w:cs="Times New Roman"/>
-          <w:sz w:val="24"/>
-          <w:szCs w:val="24"/>
-          <w:shd w:val="clear" w:color="auto" w:fill="C9DAF8"/>
-        </w:rPr>
-        <w:t>.</w:t>
+        </w:rPr>
+      </w:pPr>
+      <w:r>
+        <w:rPr>
+          <w:rFonts w:ascii="Times New Roman" w:hAnsi="Times New Roman" w:eastAsia="Times New Roman" w:cs="Times New Roman"/>
+          <w:sz w:val="24"/>
+          <w:szCs w:val="24"/>
+          <w:lang w:val="uk-UA"/>
+        </w:rPr>
+        <w:t>{{#if decision.civil_code_basis == "applicable"}}</w:t>
       </w:r>
     </w:p>
     <w:p>
@@ -1672,77 +1725,101 @@
           <w:rFonts w:ascii="Times New Roman" w:eastAsia="Times New Roman" w:hAnsi="Times New Roman" w:cs="Times New Roman"/>
           <w:sz w:val="24"/>
           <w:szCs w:val="24"/>
-          <w:shd w:val="clear" w:color="auto" w:fill="C9DAF8"/>
-        </w:rPr>
-      </w:pPr>
-      <w:r>
-        <w:rPr>
-          <w:rFonts w:ascii="Times New Roman" w:eastAsia="Times New Roman" w:hAnsi="Times New Roman" w:cs="Times New Roman"/>
-          <w:sz w:val="24"/>
-          <w:szCs w:val="24"/>
-          <w:shd w:val="clear" w:color="auto" w:fill="C9DAF8"/>
-        </w:rPr>
-        <w:t>За змістом ч.</w:t>
-      </w:r>
-      <w:r>
-        <w:rPr>
-          <w:rFonts w:ascii="Times New Roman" w:eastAsia="Times New Roman" w:hAnsi="Times New Roman" w:cs="Times New Roman"/>
-          <w:b/>
-          <w:bCs/>
-          <w:sz w:val="24"/>
-          <w:szCs w:val="24"/>
-          <w:shd w:val="clear" w:color="auto" w:fill="C9DAF8"/>
-        </w:rPr>
-        <w:t> </w:t>
-      </w:r>
-      <w:r>
-        <w:rPr>
-          <w:rFonts w:ascii="Times New Roman" w:eastAsia="Times New Roman" w:hAnsi="Times New Roman" w:cs="Times New Roman"/>
-          <w:sz w:val="24"/>
-          <w:szCs w:val="24"/>
-          <w:shd w:val="clear" w:color="auto" w:fill="C9DAF8"/>
-        </w:rPr>
-        <w:t>5 ст.</w:t>
-      </w:r>
-      <w:r>
-        <w:rPr>
-          <w:rFonts w:ascii="Times New Roman" w:eastAsia="Times New Roman" w:hAnsi="Times New Roman" w:cs="Times New Roman"/>
-          <w:b/>
-          <w:bCs/>
-          <w:sz w:val="24"/>
-          <w:szCs w:val="24"/>
-          <w:shd w:val="clear" w:color="auto" w:fill="C9DAF8"/>
-        </w:rPr>
-        <w:t> </w:t>
-      </w:r>
-      <w:r>
-        <w:rPr>
-          <w:rFonts w:ascii="Times New Roman" w:eastAsia="Times New Roman" w:hAnsi="Times New Roman" w:cs="Times New Roman"/>
-          <w:sz w:val="24"/>
-          <w:szCs w:val="24"/>
-          <w:shd w:val="clear" w:color="auto" w:fill="C9DAF8"/>
-        </w:rPr>
-        <w:t xml:space="preserve">254 Цивільного кодексу України </w:t>
-      </w:r>
-      <w:r>
-        <w:rPr>
-          <w:rFonts w:ascii="Times New Roman" w:eastAsia="Times New Roman" w:hAnsi="Times New Roman" w:cs="Times New Roman"/>
-          <w:sz w:val="24"/>
-          <w:szCs w:val="24"/>
-          <w:u w:val="single"/>
-          <w:shd w:val="clear" w:color="auto" w:fill="C9DAF8"/>
-        </w:rPr>
-        <w:t>якщо останній день строку припадає на вихідний, святковий або інший неробочий день, що визначений відповідно до закону у місці вчинення певної дії, днем закінчення строку є перший за ним робочий день</w:t>
-      </w:r>
-      <w:r>
-        <w:rPr>
-          <w:rFonts w:ascii="Times New Roman" w:eastAsia="Times New Roman" w:hAnsi="Times New Roman" w:cs="Times New Roman"/>
-          <w:sz w:val="24"/>
-          <w:szCs w:val="24"/>
-          <w:shd w:val="clear" w:color="auto" w:fill="C9DAF8"/>
-        </w:rPr>
-        <w:t>.</w:t>
-      </w:r>
+        </w:rPr>
+      </w:pPr>
+      <w:r>
+        <w:rPr>
+          <w:rFonts w:ascii="Times New Roman" w:hAnsi="Times New Roman" w:eastAsia="Times New Roman" w:cs="Times New Roman"/>
+          <w:sz w:val="24"/>
+          <w:szCs w:val="24"/>
+          <w:lang w:val="uk-UA"/>
+        </w:rPr>
+        <w:t>Відповідно до роз’яснень Міністерства економіки України, що опубліковані за посиланнями:</w:t>
+      </w:r>
+    </w:p>
+    <w:p>
+      <w:pPr>
+        <w:tabs>
+          <w:tab w:val="left" w:pos="993"/>
+        </w:tabs>
+        <w:spacing w:after="0" w:line="240" w:lineRule="auto"/>
+        <w:ind w:left="720"/>
+        <w:jc w:val="left"/>
+        <w:rPr>
+          <w:rFonts w:ascii="Times New Roman" w:eastAsia="Times New Roman" w:hAnsi="Times New Roman" w:cs="Times New Roman"/>
+          <w:sz w:val="24"/>
+          <w:szCs w:val="24"/>
+        </w:rPr>
+      </w:pPr>
+      <w:hyperlink r:id="rId5" w:history="1">
+        <w:r>
+          <w:rPr>
+            <w:rFonts w:ascii="Times New Roman" w:hAnsi="Times New Roman" w:eastAsia="Times New Roman" w:cs="Times New Roman"/>
+            <w:sz w:val="24"/>
+            <w:szCs w:val="24"/>
+            <w:lang w:val="uk-UA"/>
+            <w:color w:val="0563C1"/>
+            <w:u w:val="single"/>
+          </w:rPr>
+          <w:t>https://www.me.gov.ua/InfoRez/Details?id=3d8b5293-1542-45e7-8cab-60768b9ecc09&amp;lang=uk-UA</w:t>
+        </w:r>
+      </w:hyperlink>
+    </w:p>
+    <w:p>
+      <w:pPr>
+        <w:tabs>
+          <w:tab w:val="left" w:pos="993"/>
+        </w:tabs>
+        <w:spacing w:after="0" w:line="240" w:lineRule="auto"/>
+        <w:ind w:left="720"/>
+        <w:jc w:val="left"/>
+        <w:rPr>
+          <w:rFonts w:ascii="Times New Roman" w:eastAsia="Times New Roman" w:hAnsi="Times New Roman" w:cs="Times New Roman"/>
+          <w:sz w:val="24"/>
+          <w:szCs w:val="24"/>
+        </w:rPr>
+      </w:pPr>
+      <w:hyperlink r:id="rId6" w:history="1">
+        <w:r>
+          <w:rPr>
+            <w:rFonts w:ascii="Times New Roman" w:hAnsi="Times New Roman" w:eastAsia="Times New Roman" w:cs="Times New Roman"/>
+            <w:sz w:val="24"/>
+            <w:szCs w:val="24"/>
+            <w:lang w:val="uk-UA"/>
+            <w:color w:val="0563C1"/>
+            <w:u w:val="single"/>
+          </w:rPr>
+          <w:t>https://me.gov.ua/InfoRez/Details?id=1c50d66b-a34f-4b83-8ae3-e1fdea208d80&amp;lang=uk-UA</w:t>
+        </w:r>
+      </w:hyperlink>
+    </w:p>
+    <w:p>
+      <w:pPr>
+        <w:tabs>
+          <w:tab w:val="left" w:pos="993"/>
+        </w:tabs>
+        <w:spacing w:after="0" w:line="240" w:lineRule="auto"/>
+        <w:ind w:left="720"/>
+        <w:jc w:val="left"/>
+        <w:rPr>
+          <w:rFonts w:ascii="Times New Roman" w:eastAsia="Times New Roman" w:hAnsi="Times New Roman" w:cs="Times New Roman"/>
+          <w:sz w:val="24"/>
+          <w:szCs w:val="24"/>
+        </w:rPr>
+      </w:pPr>
+      <w:hyperlink r:id="rId7" w:history="1">
+        <w:r>
+          <w:rPr>
+            <w:rFonts w:ascii="Times New Roman" w:hAnsi="Times New Roman" w:eastAsia="Times New Roman" w:cs="Times New Roman"/>
+            <w:sz w:val="24"/>
+            <w:szCs w:val="24"/>
+            <w:lang w:val="uk-UA"/>
+            <w:color w:val="0563C1"/>
+            <w:u w:val="single"/>
+          </w:rPr>
+          <w:t>https://me.gov.ua/InfoRez/Details?id=011d5df6-768e-46e9-9f66-86a71737584d&amp;lang=uk-UA</w:t>
+        </w:r>
+      </w:hyperlink>
     </w:p>
     <w:p>
       <w:pPr>
@@ -1756,73 +1833,25 @@
           <w:rFonts w:ascii="Times New Roman" w:eastAsia="Times New Roman" w:hAnsi="Times New Roman" w:cs="Times New Roman"/>
           <w:sz w:val="24"/>
           <w:szCs w:val="24"/>
-          <w:shd w:val="clear" w:color="auto" w:fill="C9DAF8"/>
-        </w:rPr>
-      </w:pPr>
-      <w:r>
-        <w:rPr>
-          <w:rFonts w:ascii="Times New Roman" w:eastAsia="Times New Roman" w:hAnsi="Times New Roman" w:cs="Times New Roman"/>
-          <w:sz w:val="24"/>
-          <w:szCs w:val="24"/>
-          <w:shd w:val="clear" w:color="auto" w:fill="C9DAF8"/>
-        </w:rPr>
-        <w:t>Частиною 1 ст.</w:t>
-      </w:r>
-      <w:r>
-        <w:rPr>
-          <w:rFonts w:ascii="Times New Roman" w:eastAsia="Times New Roman" w:hAnsi="Times New Roman" w:cs="Times New Roman"/>
-          <w:b/>
-          <w:bCs/>
-          <w:sz w:val="24"/>
-          <w:szCs w:val="24"/>
-          <w:shd w:val="clear" w:color="auto" w:fill="C9DAF8"/>
-        </w:rPr>
-        <w:t> </w:t>
-      </w:r>
-      <w:r>
-        <w:rPr>
-          <w:rFonts w:ascii="Times New Roman" w:eastAsia="Times New Roman" w:hAnsi="Times New Roman" w:cs="Times New Roman"/>
-          <w:sz w:val="24"/>
-          <w:szCs w:val="24"/>
-          <w:shd w:val="clear" w:color="auto" w:fill="C9DAF8"/>
-        </w:rPr>
-        <w:t xml:space="preserve">255 Цивільного кодексу України встановлено, якщо строк встановлено для вчинення дії, </w:t>
-      </w:r>
-      <w:r>
-        <w:rPr>
-          <w:rFonts w:ascii="Times New Roman" w:eastAsia="Times New Roman" w:hAnsi="Times New Roman" w:cs="Times New Roman"/>
-          <w:sz w:val="24"/>
-          <w:szCs w:val="24"/>
-          <w:u w:val="single"/>
-          <w:shd w:val="clear" w:color="auto" w:fill="C9DAF8"/>
-        </w:rPr>
-        <w:t>вона може бути вчинена до закінчення останнього дня строку</w:t>
-      </w:r>
-      <w:r>
-        <w:rPr>
-          <w:rFonts w:ascii="Times New Roman" w:eastAsia="Times New Roman" w:hAnsi="Times New Roman" w:cs="Times New Roman"/>
-          <w:sz w:val="24"/>
-          <w:szCs w:val="24"/>
-          <w:shd w:val="clear" w:color="auto" w:fill="C9DAF8"/>
-        </w:rPr>
-        <w:t>.</w:t>
+        </w:rPr>
+      </w:pPr>
+      <w:r>
+        <w:rPr>
+          <w:rFonts w:ascii="Times New Roman" w:hAnsi="Times New Roman" w:eastAsia="Times New Roman" w:cs="Times New Roman"/>
+          <w:sz w:val="24"/>
+          <w:szCs w:val="24"/>
+          <w:lang w:val="uk-UA"/>
+        </w:rPr>
+        <w:t>Закон України «Про публічні закупівлі» (далі – Закон) визначає правові та економічні засади здійснення закупівель товарів, робіт і послуг для забезпечення потреб держави, територіальних громад та об’єднаних територіальних громад.</w:t>
       </w:r>
     </w:p>
     <w:p>
       <w:pPr>
-        <w:pBdr>
-          <w:top w:val="none" w:sz="0" w:space="0" w:color="000000"/>
-          <w:left w:val="none" w:sz="0" w:space="0" w:color="000000"/>
-          <w:bottom w:val="none" w:sz="0" w:space="0" w:color="000000"/>
-          <w:right w:val="none" w:sz="0" w:space="0" w:color="000000"/>
-          <w:between w:val="none" w:sz="0" w:space="0" w:color="000000"/>
-        </w:pBdr>
-        <w:shd w:val="clear" w:color="auto" w:fill="FFFFFF"/>
         <w:tabs>
           <w:tab w:val="left" w:pos="993"/>
         </w:tabs>
         <w:spacing w:after="0" w:line="240" w:lineRule="auto"/>
-        <w:ind w:firstLine="566"/>
+        <w:ind w:firstLine="567"/>
         <w:jc w:val="both"/>
         <w:rPr>
           <w:rFonts w:ascii="Times New Roman" w:eastAsia="Times New Roman" w:hAnsi="Times New Roman" w:cs="Times New Roman"/>
@@ -1830,6 +1859,87 @@
           <w:szCs w:val="24"/>
         </w:rPr>
       </w:pPr>
+      <w:r>
+        <w:rPr>
+          <w:rFonts w:ascii="Times New Roman" w:hAnsi="Times New Roman" w:eastAsia="Times New Roman" w:cs="Times New Roman"/>
+          <w:sz w:val="24"/>
+          <w:szCs w:val="24"/>
+          <w:lang w:val="uk-UA"/>
+        </w:rPr>
+        <w:t>Відповідно до ч. 1 ст. 253 Цивільного кодексу України перебіг строку починається з наступного дня після відповідної календарної дати або настання події, з якою пов’язано його початок.</w:t>
+      </w:r>
+    </w:p>
+    <w:p>
+      <w:pPr>
+        <w:tabs>
+          <w:tab w:val="left" w:pos="993"/>
+        </w:tabs>
+        <w:spacing w:after="0" w:line="240" w:lineRule="auto"/>
+        <w:ind w:firstLine="567"/>
+        <w:jc w:val="both"/>
+        <w:rPr>
+          <w:rFonts w:ascii="Times New Roman" w:eastAsia="Times New Roman" w:hAnsi="Times New Roman" w:cs="Times New Roman"/>
+          <w:sz w:val="24"/>
+          <w:szCs w:val="24"/>
+        </w:rPr>
+      </w:pPr>
+      <w:r>
+        <w:rPr>
+          <w:rFonts w:ascii="Times New Roman" w:hAnsi="Times New Roman" w:eastAsia="Times New Roman" w:cs="Times New Roman"/>
+          <w:sz w:val="24"/>
+          <w:szCs w:val="24"/>
+          <w:lang w:val="uk-UA"/>
+        </w:rPr>
+        <w:t>За змістом ч. 5 ст. 254 Цивільного кодексу України якщо останній день строку припадає на вихідний, святковий або інший неробочий день, що визначений відповідно до закону у місці вчинення певної дії, днем закінчення строку є перший за ним робочий день.</w:t>
+      </w:r>
+    </w:p>
+    <w:p>
+      <w:pPr>
+        <w:tabs>
+          <w:tab w:val="left" w:pos="993"/>
+        </w:tabs>
+        <w:spacing w:after="0" w:line="240" w:lineRule="auto"/>
+        <w:ind w:firstLine="567"/>
+        <w:jc w:val="both"/>
+        <w:rPr>
+          <w:rFonts w:ascii="Times New Roman" w:eastAsia="Times New Roman" w:hAnsi="Times New Roman" w:cs="Times New Roman"/>
+          <w:sz w:val="24"/>
+          <w:szCs w:val="24"/>
+        </w:rPr>
+      </w:pPr>
+      <w:r>
+        <w:rPr>
+          <w:rFonts w:ascii="Times New Roman" w:hAnsi="Times New Roman" w:eastAsia="Times New Roman" w:cs="Times New Roman"/>
+          <w:sz w:val="24"/>
+          <w:szCs w:val="24"/>
+          <w:lang w:val="uk-UA"/>
+        </w:rPr>
+        <w:t>Частиною 1 ст. 255 Цивільного кодексу України встановлено, якщо строк встановлено для вчинення дії, вона може бути вчинена до закінчення останнього дня строку.</w:t>
+      </w:r>
+    </w:p>
+    <w:p>
+      <w:pPr>
+        <w:tabs>
+          <w:tab w:val="left" w:pos="993"/>
+        </w:tabs>
+        <w:spacing w:after="0" w:line="240" w:lineRule="auto"/>
+        <w:ind w:firstLine="567"/>
+        <w:jc w:val="both"/>
+        <w:rPr>
+          <w:rFonts w:ascii="Times New Roman" w:eastAsia="Times New Roman" w:hAnsi="Times New Roman" w:cs="Times New Roman"/>
+          <w:sz w:val="24"/>
+          <w:szCs w:val="24"/>
+        </w:rPr>
+      </w:pPr>
+      <w:r>
+        <w:rPr>
+          <w:rFonts w:ascii="Times New Roman" w:hAnsi="Times New Roman" w:eastAsia="Times New Roman" w:cs="Times New Roman"/>
+          <w:sz w:val="24"/>
+          <w:szCs w:val="24"/>
+          <w:lang w:val="uk-UA"/>
+        </w:rPr>
+        <w:t>{{/if}}</w:t>
+      </w:r>
     </w:p>
     <w:p>
       <w:pPr>
@@ -1856,6 +1966,7 @@
           <w:sz w:val="24"/>
           <w:szCs w:val="24"/>
         </w:rPr>
+        <w:lastRenderedPageBreak/>
         <w:t>За результатами розгляду встановлено:</w:t>
       </w:r>
     </w:p>
@@ -1910,7 +2021,6 @@
                 <w:b/>
                 <w:bCs/>
               </w:rPr>
-              <w:lastRenderedPageBreak/>
               <w:t>Дата визначення Постачальника переможцем/оприлюднення повідомлення про намір укласти договір</w:t>
             </w:r>
           </w:p>
@@ -1941,12 +2051,14 @@
               </w:rPr>
               <w:t xml:space="preserve">{{ </w:t>
             </w:r>
+            <w:proofErr w:type="spellStart"/>
             <w:r>
               <w:rPr>
                 <w:rFonts w:ascii="Times New Roman" w:eastAsia="Times New Roman" w:hAnsi="Times New Roman" w:cs="Times New Roman"/>
               </w:rPr>
               <w:t>winner_date</w:t>
             </w:r>
+            <w:proofErr w:type="spellEnd"/>
             <w:r>
               <w:rPr>
                 <w:rFonts w:ascii="Times New Roman" w:eastAsia="Times New Roman" w:hAnsi="Times New Roman" w:cs="Times New Roman"/>
@@ -2023,12 +2135,14 @@
               </w:rPr>
               <w:t xml:space="preserve">{{ </w:t>
             </w:r>
+            <w:proofErr w:type="spellStart"/>
             <w:r>
               <w:rPr>
                 <w:rFonts w:ascii="Times New Roman" w:eastAsia="Times New Roman" w:hAnsi="Times New Roman" w:cs="Times New Roman"/>
               </w:rPr>
               <w:t>rejection_date</w:t>
             </w:r>
+            <w:proofErr w:type="spellEnd"/>
             <w:r>
               <w:rPr>
                 <w:rFonts w:ascii="Times New Roman" w:eastAsia="Times New Roman" w:hAnsi="Times New Roman" w:cs="Times New Roman"/>
@@ -2102,6 +2216,7 @@
               </w:rPr>
               <w:t xml:space="preserve">{{ </w:t>
             </w:r>
+            <w:proofErr w:type="spellStart"/>
             <w:r>
               <w:rPr>
                 <w:rFonts w:ascii="Times New Roman" w:eastAsia="Times New Roman" w:hAnsi="Times New Roman" w:cs="Times New Roman"/>
@@ -2110,6 +2225,7 @@
               </w:rPr>
               <w:t>rejection_reason</w:t>
             </w:r>
+            <w:proofErr w:type="spellEnd"/>
             <w:r>
               <w:rPr>
                 <w:rFonts w:ascii="Times New Roman" w:eastAsia="Times New Roman" w:hAnsi="Times New Roman" w:cs="Times New Roman"/>
@@ -2184,94 +2300,99 @@
                 <w:rFonts w:ascii="Times New Roman" w:eastAsia="Times New Roman" w:hAnsi="Times New Roman" w:cs="Times New Roman"/>
                 <w:i/>
                 <w:iCs/>
-                <w:highlight w:val="cyan"/>
               </w:rPr>
             </w:pPr>
             <w:r>
               <w:rPr>
                 <w:rFonts w:ascii="Times New Roman" w:eastAsia="Times New Roman" w:hAnsi="Times New Roman" w:cs="Times New Roman"/>
-                <w:highlight w:val="cyan"/>
-              </w:rPr>
-              <w:t xml:space="preserve">лист </w:t>
-            </w:r>
-            <w:r>
-              <w:rPr>
-                <w:rFonts w:ascii="Times New Roman" w:eastAsia="Times New Roman" w:hAnsi="Times New Roman" w:cs="Times New Roman"/>
-                <w:shd w:val="clear" w:color="auto" w:fill="FF9900"/>
-              </w:rPr>
-              <w:t xml:space="preserve">{{ </w:t>
-            </w:r>
-            <w:r>
-              <w:rPr>
-                <w:rFonts w:ascii="Times New Roman" w:eastAsia="Times New Roman" w:hAnsi="Times New Roman" w:cs="Times New Roman"/>
-                <w:shd w:val="clear" w:color="auto" w:fill="FF9900"/>
-              </w:rPr>
-              <w:t>supplier_short_name }}</w:t>
-            </w:r>
-            <w:r>
-              <w:rPr>
-                <w:rFonts w:ascii="Times New Roman" w:eastAsia="Times New Roman" w:hAnsi="Times New Roman" w:cs="Times New Roman"/>
-                <w:shd w:val="clear" w:color="auto" w:fill="FF9900"/>
-              </w:rPr>
-              <w:t xml:space="preserve"> </w:t>
-            </w:r>
-            <w:r>
-              <w:rPr>
-                <w:rFonts w:ascii="Times New Roman" w:eastAsia="Times New Roman" w:hAnsi="Times New Roman" w:cs="Times New Roman"/>
-                <w:highlight w:val="cyan"/>
-              </w:rPr>
-              <w:t xml:space="preserve">від </w:t>
-            </w:r>
-            <w:r>
-              <w:rPr>
-                <w:rFonts w:ascii="Times New Roman" w:eastAsia="Times New Roman" w:hAnsi="Times New Roman" w:cs="Times New Roman"/>
-                <w:highlight w:val="cyan"/>
-              </w:rPr>
-              <w:t>{{ refusal_date }}</w:t>
-            </w:r>
-            <w:r>
-              <w:rPr>
-                <w:rFonts w:ascii="Times New Roman" w:eastAsia="Times New Roman" w:hAnsi="Times New Roman" w:cs="Times New Roman"/>
-                <w:highlight w:val="cyan"/>
-              </w:rPr>
-              <w:t xml:space="preserve"> Вих. № </w:t>
-            </w:r>
-            <w:r>
-              <w:rPr>
-                <w:rFonts w:ascii="Times New Roman" w:eastAsia="Times New Roman" w:hAnsi="Times New Roman" w:cs="Times New Roman"/>
-                <w:highlight w:val="cyan"/>
-              </w:rPr>
-              <w:t>{{ refusal_outgoing_number }}</w:t>
-            </w:r>
-            <w:r>
-              <w:rPr>
-                <w:rFonts w:ascii="Times New Roman" w:eastAsia="Times New Roman" w:hAnsi="Times New Roman" w:cs="Times New Roman"/>
-                <w:highlight w:val="cyan"/>
-              </w:rPr>
-              <w:t xml:space="preserve"> </w:t>
+              </w:rPr>
+              <w:t xml:space="preserve">лист {{ </w:t>
+            </w:r>
+            <w:proofErr w:type="spellStart"/>
+            <w:r>
+              <w:rPr>
+                <w:rFonts w:ascii="Times New Roman" w:eastAsia="Times New Roman" w:hAnsi="Times New Roman" w:cs="Times New Roman"/>
+              </w:rPr>
+              <w:t>supplier_short_name</w:t>
+            </w:r>
+            <w:proofErr w:type="spellEnd"/>
+            <w:r>
+              <w:rPr>
+                <w:rFonts w:ascii="Times New Roman" w:eastAsia="Times New Roman" w:hAnsi="Times New Roman" w:cs="Times New Roman"/>
+              </w:rPr>
+              <w:t xml:space="preserve"> }} від {{ </w:t>
+            </w:r>
+            <w:proofErr w:type="spellStart"/>
+            <w:r>
+              <w:rPr>
+                <w:rFonts w:ascii="Times New Roman" w:eastAsia="Times New Roman" w:hAnsi="Times New Roman" w:cs="Times New Roman"/>
+              </w:rPr>
+              <w:t>refusal_date</w:t>
+            </w:r>
+            <w:proofErr w:type="spellEnd"/>
+            <w:r>
+              <w:rPr>
+                <w:rFonts w:ascii="Times New Roman" w:eastAsia="Times New Roman" w:hAnsi="Times New Roman" w:cs="Times New Roman"/>
+              </w:rPr>
+              <w:t xml:space="preserve"> }} </w:t>
+            </w:r>
+            <w:proofErr w:type="spellStart"/>
+            <w:r>
+              <w:rPr>
+                <w:rFonts w:ascii="Times New Roman" w:eastAsia="Times New Roman" w:hAnsi="Times New Roman" w:cs="Times New Roman"/>
+              </w:rPr>
+              <w:t>Вих</w:t>
+            </w:r>
+            <w:proofErr w:type="spellEnd"/>
+            <w:r>
+              <w:rPr>
+                <w:rFonts w:ascii="Times New Roman" w:eastAsia="Times New Roman" w:hAnsi="Times New Roman" w:cs="Times New Roman"/>
+              </w:rPr>
+              <w:t xml:space="preserve">. № {{ </w:t>
+            </w:r>
+            <w:proofErr w:type="spellStart"/>
+            <w:r>
+              <w:rPr>
+                <w:rFonts w:ascii="Times New Roman" w:eastAsia="Times New Roman" w:hAnsi="Times New Roman" w:cs="Times New Roman"/>
+              </w:rPr>
+              <w:t>refusal_outgoing_number</w:t>
+            </w:r>
+            <w:proofErr w:type="spellEnd"/>
+            <w:r>
+              <w:rPr>
+                <w:rFonts w:ascii="Times New Roman" w:eastAsia="Times New Roman" w:hAnsi="Times New Roman" w:cs="Times New Roman"/>
+              </w:rPr>
+              <w:t xml:space="preserve"> }} </w:t>
             </w:r>
             <w:r>
               <w:rPr>
                 <w:rFonts w:ascii="Times New Roman" w:eastAsia="Times New Roman" w:hAnsi="Times New Roman" w:cs="Times New Roman"/>
                 <w:i/>
                 <w:iCs/>
-                <w:highlight w:val="cyan"/>
-              </w:rPr>
-              <w:t>(</w:t>
-            </w:r>
+              </w:rPr>
+              <w:t xml:space="preserve">({{ </w:t>
+            </w:r>
+            <w:proofErr w:type="spellStart"/>
             <w:r>
               <w:rPr>
                 <w:rFonts w:ascii="Times New Roman" w:eastAsia="Times New Roman" w:hAnsi="Times New Roman" w:cs="Times New Roman"/>
                 <w:i/>
                 <w:iCs/>
-                <w:highlight w:val="cyan"/>
-              </w:rPr>
-              <w:t>{{ refusal_document }}</w:t>
-            </w:r>
-            <w:r>
-              <w:rPr>
-                <w:rFonts w:ascii="Times New Roman" w:eastAsia="Times New Roman" w:hAnsi="Times New Roman" w:cs="Times New Roman"/>
-                <w:highlight w:val="cyan"/>
+              </w:rPr>
+              <w:t>refusal_document</w:t>
+            </w:r>
+            <w:proofErr w:type="spellEnd"/>
+            <w:r>
+              <w:rPr>
+                <w:rFonts w:ascii="Times New Roman" w:eastAsia="Times New Roman" w:hAnsi="Times New Roman" w:cs="Times New Roman"/>
+                <w:i/>
+                <w:iCs/>
+              </w:rPr>
+              <w:t xml:space="preserve"> }}</w:t>
+            </w:r>
+            <w:r>
+              <w:rPr>
+                <w:rFonts w:ascii="Times New Roman" w:eastAsia="Times New Roman" w:hAnsi="Times New Roman" w:cs="Times New Roman"/>
               </w:rPr>
               <w:t>)</w:t>
             </w:r>
@@ -2336,38 +2457,33 @@
               <w:rPr>
                 <w:rFonts w:ascii="Times New Roman" w:eastAsia="Times New Roman" w:hAnsi="Times New Roman" w:cs="Times New Roman"/>
               </w:rPr>
-              <w:t xml:space="preserve">Укладено </w:t>
-            </w:r>
-            <w:r>
-              <w:rPr>
-                <w:rFonts w:ascii="Times New Roman" w:eastAsia="Times New Roman" w:hAnsi="Times New Roman" w:cs="Times New Roman"/>
-                <w:highlight w:val="cyan"/>
-              </w:rPr>
-              <w:t xml:space="preserve">договір від {{ </w:t>
-            </w:r>
+              <w:t xml:space="preserve">Укладено договір від {{ </w:t>
+            </w:r>
+            <w:proofErr w:type="spellStart"/>
             <w:r>
               <w:rPr>
                 <w:rFonts w:ascii="Times New Roman" w:eastAsia="Times New Roman" w:hAnsi="Times New Roman" w:cs="Times New Roman"/>
               </w:rPr>
               <w:t>contract_date</w:t>
             </w:r>
-            <w:r>
-              <w:rPr>
-                <w:rFonts w:ascii="Times New Roman" w:eastAsia="Times New Roman" w:hAnsi="Times New Roman" w:cs="Times New Roman"/>
-                <w:highlight w:val="cyan"/>
+            <w:proofErr w:type="spellEnd"/>
+            <w:r>
+              <w:rPr>
+                <w:rFonts w:ascii="Times New Roman" w:eastAsia="Times New Roman" w:hAnsi="Times New Roman" w:cs="Times New Roman"/>
               </w:rPr>
               <w:t xml:space="preserve">}} № {{ </w:t>
             </w:r>
+            <w:proofErr w:type="spellStart"/>
             <w:r>
               <w:rPr>
                 <w:rFonts w:ascii="Times New Roman" w:eastAsia="Times New Roman" w:hAnsi="Times New Roman" w:cs="Times New Roman"/>
               </w:rPr>
               <w:t>contract_number</w:t>
             </w:r>
-            <w:r>
-              <w:rPr>
-                <w:rFonts w:ascii="Times New Roman" w:eastAsia="Times New Roman" w:hAnsi="Times New Roman" w:cs="Times New Roman"/>
-                <w:highlight w:val="cyan"/>
+            <w:proofErr w:type="spellEnd"/>
+            <w:r>
+              <w:rPr>
+                <w:rFonts w:ascii="Times New Roman" w:eastAsia="Times New Roman" w:hAnsi="Times New Roman" w:cs="Times New Roman"/>
               </w:rPr>
               <w:t>}}</w:t>
             </w:r>
@@ -2435,7 +2551,25 @@
                 <w:i/>
                 <w:iCs/>
               </w:rPr>
-              <w:t>{{ supplier_response }}</w:t>
+              <w:t xml:space="preserve">{{ </w:t>
+            </w:r>
+            <w:proofErr w:type="spellStart"/>
+            <w:r>
+              <w:rPr>
+                <w:rFonts w:ascii="Times New Roman" w:eastAsia="Times New Roman" w:hAnsi="Times New Roman" w:cs="Times New Roman"/>
+                <w:i/>
+                <w:iCs/>
+              </w:rPr>
+              <w:t>supplier_response</w:t>
+            </w:r>
+            <w:proofErr w:type="spellEnd"/>
+            <w:r>
+              <w:rPr>
+                <w:rFonts w:ascii="Times New Roman" w:eastAsia="Times New Roman" w:hAnsi="Times New Roman" w:cs="Times New Roman"/>
+                <w:i/>
+                <w:iCs/>
+              </w:rPr>
+              <w:t xml:space="preserve"> }}</w:t>
             </w:r>
           </w:p>
         </w:tc>
@@ -2502,7 +2636,25 @@
                 <w:i/>
                 <w:iCs/>
               </w:rPr>
-              <w:t>{{ supplier_documents }}</w:t>
+              <w:t xml:space="preserve">{{ </w:t>
+            </w:r>
+            <w:proofErr w:type="spellStart"/>
+            <w:r>
+              <w:rPr>
+                <w:rFonts w:ascii="Times New Roman" w:eastAsia="Times New Roman" w:hAnsi="Times New Roman" w:cs="Times New Roman"/>
+                <w:i/>
+                <w:iCs/>
+              </w:rPr>
+              <w:t>supplier_documents</w:t>
+            </w:r>
+            <w:proofErr w:type="spellEnd"/>
+            <w:r>
+              <w:rPr>
+                <w:rFonts w:ascii="Times New Roman" w:eastAsia="Times New Roman" w:hAnsi="Times New Roman" w:cs="Times New Roman"/>
+                <w:i/>
+                <w:iCs/>
+              </w:rPr>
+              <w:t xml:space="preserve"> }}</w:t>
             </w:r>
           </w:p>
         </w:tc>
@@ -2565,7 +2717,21 @@
               <w:rPr>
                 <w:rFonts w:ascii="Times New Roman" w:eastAsia="Times New Roman" w:hAnsi="Times New Roman" w:cs="Times New Roman"/>
               </w:rPr>
-              <w:t>{{ decision_justification }}</w:t>
+              <w:t xml:space="preserve">{{ </w:t>
+            </w:r>
+            <w:proofErr w:type="spellStart"/>
+            <w:r>
+              <w:rPr>
+                <w:rFonts w:ascii="Times New Roman" w:eastAsia="Times New Roman" w:hAnsi="Times New Roman" w:cs="Times New Roman"/>
+              </w:rPr>
+              <w:t>decision_justification</w:t>
+            </w:r>
+            <w:proofErr w:type="spellEnd"/>
+            <w:r>
+              <w:rPr>
+                <w:rFonts w:ascii="Times New Roman" w:eastAsia="Times New Roman" w:hAnsi="Times New Roman" w:cs="Times New Roman"/>
+              </w:rPr>
+              <w:t xml:space="preserve"> }}</w:t>
             </w:r>
           </w:p>
         </w:tc>
@@ -2647,64 +2813,61 @@
           <w:sz w:val="24"/>
           <w:szCs w:val="24"/>
         </w:rPr>
-        <w:t xml:space="preserve">За результатом розгляду звернення </w:t>
-      </w:r>
-      <w:r>
-        <w:rPr>
-          <w:rFonts w:ascii="Times New Roman" w:eastAsia="Times New Roman" w:hAnsi="Times New Roman" w:cs="Times New Roman"/>
-          <w:sz w:val="24"/>
-          <w:szCs w:val="24"/>
-        </w:rPr>
-        <w:t>{{ report_id }}</w:t>
-      </w:r>
-      <w:r>
-        <w:rPr>
-          <w:rFonts w:ascii="Times New Roman" w:eastAsia="Times New Roman" w:hAnsi="Times New Roman" w:cs="Times New Roman"/>
-          <w:sz w:val="24"/>
-          <w:szCs w:val="24"/>
-        </w:rPr>
-        <w:t xml:space="preserve"> </w:t>
-      </w:r>
-      <w:r>
-        <w:rPr>
-          <w:rFonts w:ascii="Times New Roman" w:eastAsia="Times New Roman" w:hAnsi="Times New Roman" w:cs="Times New Roman"/>
-          <w:sz w:val="24"/>
-          <w:szCs w:val="24"/>
-        </w:rPr>
-        <w:t>{{ customer_name_genitive }}</w:t>
-      </w:r>
-      <w:r>
-        <w:rPr>
-          <w:rFonts w:ascii="Times New Roman" w:eastAsia="Times New Roman" w:hAnsi="Times New Roman" w:cs="Times New Roman"/>
-          <w:sz w:val="24"/>
-          <w:szCs w:val="24"/>
-        </w:rPr>
-        <w:t xml:space="preserve"> (код ЄДРПОУ: </w:t>
-      </w:r>
-      <w:r>
-        <w:rPr>
-          <w:rFonts w:ascii="Times New Roman" w:eastAsia="Times New Roman" w:hAnsi="Times New Roman" w:cs="Times New Roman"/>
-          <w:sz w:val="24"/>
-          <w:szCs w:val="24"/>
-        </w:rPr>
-        <w:t>{{ customer_code }}</w:t>
-      </w:r>
-      <w:r>
-        <w:rPr>
-          <w:rFonts w:ascii="Times New Roman" w:eastAsia="Times New Roman" w:hAnsi="Times New Roman" w:cs="Times New Roman"/>
-          <w:sz w:val="24"/>
-          <w:szCs w:val="24"/>
-        </w:rPr>
-        <w:t>) щодо порушення, передбаченого</w:t>
-      </w:r>
-      <w:r>
-        <w:rPr>
-          <w:rFonts w:ascii="Times New Roman" w:eastAsia="Times New Roman" w:hAnsi="Times New Roman" w:cs="Times New Roman"/>
-          <w:sz w:val="24"/>
-          <w:szCs w:val="24"/>
-          <w:shd w:val="clear" w:color="auto" w:fill="FF9900"/>
-        </w:rPr>
-        <w:t xml:space="preserve"> </w:t>
+        <w:t xml:space="preserve">За результатом розгляду звернення {{ </w:t>
+      </w:r>
+      <w:proofErr w:type="spellStart"/>
+      <w:r>
+        <w:rPr>
+          <w:rFonts w:ascii="Times New Roman" w:eastAsia="Times New Roman" w:hAnsi="Times New Roman" w:cs="Times New Roman"/>
+          <w:sz w:val="24"/>
+          <w:szCs w:val="24"/>
+        </w:rPr>
+        <w:t>report_id</w:t>
+      </w:r>
+      <w:proofErr w:type="spellEnd"/>
+      <w:r>
+        <w:rPr>
+          <w:rFonts w:ascii="Times New Roman" w:eastAsia="Times New Roman" w:hAnsi="Times New Roman" w:cs="Times New Roman"/>
+          <w:sz w:val="24"/>
+          <w:szCs w:val="24"/>
+        </w:rPr>
+        <w:t xml:space="preserve"> }} {{ </w:t>
+      </w:r>
+      <w:proofErr w:type="spellStart"/>
+      <w:r>
+        <w:rPr>
+          <w:rFonts w:ascii="Times New Roman" w:eastAsia="Times New Roman" w:hAnsi="Times New Roman" w:cs="Times New Roman"/>
+          <w:sz w:val="24"/>
+          <w:szCs w:val="24"/>
+        </w:rPr>
+        <w:t>customer_name_genitive</w:t>
+      </w:r>
+      <w:proofErr w:type="spellEnd"/>
+      <w:r>
+        <w:rPr>
+          <w:rFonts w:ascii="Times New Roman" w:eastAsia="Times New Roman" w:hAnsi="Times New Roman" w:cs="Times New Roman"/>
+          <w:sz w:val="24"/>
+          <w:szCs w:val="24"/>
+        </w:rPr>
+        <w:t xml:space="preserve"> }} (код ЄДРПОУ: {{ </w:t>
+      </w:r>
+      <w:proofErr w:type="spellStart"/>
+      <w:r>
+        <w:rPr>
+          <w:rFonts w:ascii="Times New Roman" w:eastAsia="Times New Roman" w:hAnsi="Times New Roman" w:cs="Times New Roman"/>
+          <w:sz w:val="24"/>
+          <w:szCs w:val="24"/>
+        </w:rPr>
+        <w:t>customer_code</w:t>
+      </w:r>
+      <w:proofErr w:type="spellEnd"/>
+      <w:r>
+        <w:rPr>
+          <w:rFonts w:ascii="Times New Roman" w:eastAsia="Times New Roman" w:hAnsi="Times New Roman" w:cs="Times New Roman"/>
+          <w:sz w:val="24"/>
+          <w:szCs w:val="24"/>
+        </w:rPr>
+        <w:t xml:space="preserve"> }}) щодо порушення, передбаченого</w:t>
       </w:r>
       <w:r>
         <w:rPr>
@@ -2713,9 +2876,8 @@
           <w:bCs/>
           <w:sz w:val="24"/>
           <w:szCs w:val="24"/>
-          <w:shd w:val="clear" w:color="auto" w:fill="FF9900"/>
-        </w:rPr>
-        <w:t>{{ p49_reference }}</w:t>
+        </w:rPr>
+        <w:t xml:space="preserve"> {{ p49_reference }}</w:t>
       </w:r>
       <w:r>
         <w:rPr>
@@ -2768,56 +2930,63 @@
           <w:sz w:val="24"/>
           <w:szCs w:val="24"/>
         </w:rPr>
-        <w:t xml:space="preserve">822, з боку Постачальника – </w:t>
-      </w:r>
-      <w:r>
-        <w:rPr>
-          <w:rFonts w:ascii="Times New Roman" w:eastAsia="Times New Roman" w:hAnsi="Times New Roman" w:cs="Times New Roman"/>
-          <w:sz w:val="24"/>
-          <w:szCs w:val="24"/>
-        </w:rPr>
-        <w:t>{{ supplier_name_genitive }}</w:t>
-      </w:r>
-      <w:r>
-        <w:rPr>
-          <w:rFonts w:ascii="Times New Roman" w:eastAsia="Times New Roman" w:hAnsi="Times New Roman" w:cs="Times New Roman"/>
-          <w:sz w:val="24"/>
-          <w:szCs w:val="24"/>
-        </w:rPr>
-        <w:t xml:space="preserve"> (</w:t>
-      </w:r>
-      <w:r>
-        <w:rPr>
-          <w:rFonts w:ascii="Times New Roman" w:eastAsia="Times New Roman" w:hAnsi="Times New Roman" w:cs="Times New Roman"/>
-          <w:sz w:val="24"/>
-          <w:szCs w:val="24"/>
-        </w:rPr>
-        <w:t>{{ supplier_code_label }}</w:t>
-      </w:r>
-      <w:r>
-        <w:rPr>
-          <w:rFonts w:ascii="Times New Roman" w:eastAsia="Times New Roman" w:hAnsi="Times New Roman" w:cs="Times New Roman"/>
-          <w:sz w:val="24"/>
-          <w:szCs w:val="24"/>
-        </w:rPr>
-        <w:t xml:space="preserve">: </w:t>
-      </w:r>
-      <w:r>
-        <w:rPr>
-          <w:rFonts w:ascii="Times New Roman" w:eastAsia="Times New Roman" w:hAnsi="Times New Roman" w:cs="Times New Roman"/>
-          <w:sz w:val="24"/>
-          <w:szCs w:val="24"/>
-        </w:rPr>
-        <w:t>{{ supplier_code }}</w:t>
-      </w:r>
-      <w:r>
-        <w:rPr>
-          <w:rFonts w:ascii="Times New Roman" w:eastAsia="Times New Roman" w:hAnsi="Times New Roman" w:cs="Times New Roman"/>
-          <w:sz w:val="24"/>
-          <w:szCs w:val="24"/>
-        </w:rPr>
-        <w:t xml:space="preserve">) в закупівлі {{ </w:t>
-      </w:r>
+        <w:t xml:space="preserve">822, з боку Постачальника – {{ </w:t>
+      </w:r>
+      <w:proofErr w:type="spellStart"/>
+      <w:r>
+        <w:rPr>
+          <w:rFonts w:ascii="Times New Roman" w:eastAsia="Times New Roman" w:hAnsi="Times New Roman" w:cs="Times New Roman"/>
+          <w:sz w:val="24"/>
+          <w:szCs w:val="24"/>
+        </w:rPr>
+        <w:t>supplier_name_genitive</w:t>
+      </w:r>
+      <w:proofErr w:type="spellEnd"/>
+      <w:r>
+        <w:rPr>
+          <w:rFonts w:ascii="Times New Roman" w:eastAsia="Times New Roman" w:hAnsi="Times New Roman" w:cs="Times New Roman"/>
+          <w:sz w:val="24"/>
+          <w:szCs w:val="24"/>
+        </w:rPr>
+        <w:t xml:space="preserve"> }} ({{ </w:t>
+      </w:r>
+      <w:proofErr w:type="spellStart"/>
+      <w:r>
+        <w:rPr>
+          <w:rFonts w:ascii="Times New Roman" w:eastAsia="Times New Roman" w:hAnsi="Times New Roman" w:cs="Times New Roman"/>
+          <w:sz w:val="24"/>
+          <w:szCs w:val="24"/>
+        </w:rPr>
+        <w:t>supplier_code_label</w:t>
+      </w:r>
+      <w:proofErr w:type="spellEnd"/>
+      <w:r>
+        <w:rPr>
+          <w:rFonts w:ascii="Times New Roman" w:eastAsia="Times New Roman" w:hAnsi="Times New Roman" w:cs="Times New Roman"/>
+          <w:sz w:val="24"/>
+          <w:szCs w:val="24"/>
+        </w:rPr>
+        <w:t xml:space="preserve"> }}: {{ </w:t>
+      </w:r>
+      <w:proofErr w:type="spellStart"/>
+      <w:r>
+        <w:rPr>
+          <w:rFonts w:ascii="Times New Roman" w:eastAsia="Times New Roman" w:hAnsi="Times New Roman" w:cs="Times New Roman"/>
+          <w:sz w:val="24"/>
+          <w:szCs w:val="24"/>
+        </w:rPr>
+        <w:t>supplier_code</w:t>
+      </w:r>
+      <w:proofErr w:type="spellEnd"/>
+      <w:r>
+        <w:rPr>
+          <w:rFonts w:ascii="Times New Roman" w:eastAsia="Times New Roman" w:hAnsi="Times New Roman" w:cs="Times New Roman"/>
+          <w:sz w:val="24"/>
+          <w:szCs w:val="24"/>
+        </w:rPr>
+        <w:t xml:space="preserve"> }}) в закупівлі {{ </w:t>
+      </w:r>
+      <w:proofErr w:type="spellStart"/>
       <w:r>
         <w:rPr>
           <w:rFonts w:ascii="Times New Roman" w:eastAsia="Times New Roman" w:hAnsi="Times New Roman" w:cs="Times New Roman"/>
@@ -2826,6 +2995,7 @@
         </w:rPr>
         <w:t>procurement_id</w:t>
       </w:r>
+      <w:proofErr w:type="spellEnd"/>
       <w:r>
         <w:rPr>
           <w:rFonts w:ascii="Times New Roman" w:eastAsia="Times New Roman" w:hAnsi="Times New Roman" w:cs="Times New Roman"/>
@@ -2956,134 +3126,115 @@
           <w:sz w:val="24"/>
           <w:szCs w:val="24"/>
         </w:rPr>
-        <w:t>–</w:t>
-      </w:r>
-      <w:r>
-        <w:rPr>
-          <w:rFonts w:ascii="Times New Roman" w:eastAsia="Times New Roman" w:hAnsi="Times New Roman" w:cs="Times New Roman"/>
-          <w:sz w:val="24"/>
-          <w:szCs w:val="24"/>
-          <w:shd w:val="clear" w:color="auto" w:fill="FF9900"/>
-        </w:rPr>
-        <w:t xml:space="preserve"> </w:t>
-      </w:r>
-      <w:r>
-        <w:rPr>
-          <w:rFonts w:ascii="Times New Roman" w:eastAsia="Times New Roman" w:hAnsi="Times New Roman" w:cs="Times New Roman"/>
-          <w:sz w:val="24"/>
-          <w:szCs w:val="24"/>
-          <w:shd w:val="clear" w:color="auto" w:fill="FF9900"/>
-        </w:rPr>
-        <w:t xml:space="preserve">{{ customer_name_accusative }} </w:t>
-      </w:r>
-      <w:r>
-        <w:rPr>
-          <w:rFonts w:ascii="Times New Roman" w:eastAsia="Times New Roman" w:hAnsi="Times New Roman" w:cs="Times New Roman"/>
-          <w:sz w:val="24"/>
-          <w:szCs w:val="24"/>
-        </w:rPr>
-        <w:t xml:space="preserve">(код ЄДРПОУ: </w:t>
-      </w:r>
-      <w:r>
-        <w:rPr>
-          <w:rFonts w:ascii="Times New Roman" w:eastAsia="Times New Roman" w:hAnsi="Times New Roman" w:cs="Times New Roman"/>
-          <w:sz w:val="24"/>
-          <w:szCs w:val="24"/>
-        </w:rPr>
-        <w:t>{{ customer_code }}</w:t>
-      </w:r>
-      <w:r>
-        <w:rPr>
-          <w:rFonts w:ascii="Times New Roman" w:eastAsia="Times New Roman" w:hAnsi="Times New Roman" w:cs="Times New Roman"/>
-          <w:sz w:val="24"/>
-          <w:szCs w:val="24"/>
-        </w:rPr>
-        <w:t>) та Постачальника</w:t>
-      </w:r>
-      <w:r>
-        <w:rPr>
-          <w:rFonts w:ascii="Times New Roman" w:eastAsia="Times New Roman" w:hAnsi="Times New Roman" w:cs="Times New Roman"/>
-          <w:b/>
-          <w:bCs/>
-          <w:sz w:val="24"/>
-          <w:szCs w:val="24"/>
-        </w:rPr>
-        <w:t> </w:t>
-      </w:r>
-      <w:r>
-        <w:rPr>
-          <w:rFonts w:ascii="Times New Roman" w:eastAsia="Times New Roman" w:hAnsi="Times New Roman" w:cs="Times New Roman"/>
-          <w:sz w:val="24"/>
-          <w:szCs w:val="24"/>
-        </w:rPr>
-        <w:t xml:space="preserve">– </w:t>
-      </w:r>
-      <w:r>
-        <w:rPr>
-          <w:rFonts w:ascii="Times New Roman" w:eastAsia="Times New Roman" w:hAnsi="Times New Roman" w:cs="Times New Roman"/>
-          <w:sz w:val="24"/>
-          <w:szCs w:val="24"/>
-          <w:shd w:val="clear" w:color="auto" w:fill="FF9900"/>
-        </w:rPr>
-        <w:t xml:space="preserve">{{ </w:t>
-      </w:r>
-      <w:r>
-        <w:rPr>
-          <w:rFonts w:ascii="Times New Roman" w:eastAsia="Times New Roman" w:hAnsi="Times New Roman" w:cs="Times New Roman"/>
-          <w:sz w:val="24"/>
-          <w:szCs w:val="24"/>
-          <w:shd w:val="clear" w:color="auto" w:fill="FF9900"/>
+        <w:t xml:space="preserve">– {{ </w:t>
+      </w:r>
+      <w:proofErr w:type="spellStart"/>
+      <w:r>
+        <w:rPr>
+          <w:rFonts w:ascii="Times New Roman" w:eastAsia="Times New Roman" w:hAnsi="Times New Roman" w:cs="Times New Roman"/>
+          <w:sz w:val="24"/>
+          <w:szCs w:val="24"/>
+        </w:rPr>
+        <w:t>customer_name_accusative</w:t>
+      </w:r>
+      <w:proofErr w:type="spellEnd"/>
+      <w:r>
+        <w:rPr>
+          <w:rFonts w:ascii="Times New Roman" w:eastAsia="Times New Roman" w:hAnsi="Times New Roman" w:cs="Times New Roman"/>
+          <w:sz w:val="24"/>
+          <w:szCs w:val="24"/>
+        </w:rPr>
+        <w:t xml:space="preserve"> }} (код ЄДРПОУ: {{ </w:t>
+      </w:r>
+      <w:proofErr w:type="spellStart"/>
+      <w:r>
+        <w:rPr>
+          <w:rFonts w:ascii="Times New Roman" w:eastAsia="Times New Roman" w:hAnsi="Times New Roman" w:cs="Times New Roman"/>
+          <w:sz w:val="24"/>
+          <w:szCs w:val="24"/>
+        </w:rPr>
+        <w:t>customer_code</w:t>
+      </w:r>
+      <w:proofErr w:type="spellEnd"/>
+      <w:r>
+        <w:rPr>
+          <w:rFonts w:ascii="Times New Roman" w:eastAsia="Times New Roman" w:hAnsi="Times New Roman" w:cs="Times New Roman"/>
+          <w:sz w:val="24"/>
+          <w:szCs w:val="24"/>
+        </w:rPr>
+        <w:t xml:space="preserve"> }}) та Постачальника – {{ </w:t>
+      </w:r>
+      <w:proofErr w:type="spellStart"/>
+      <w:r>
+        <w:rPr>
+          <w:rFonts w:ascii="Times New Roman" w:eastAsia="Times New Roman" w:hAnsi="Times New Roman" w:cs="Times New Roman"/>
+          <w:sz w:val="24"/>
+          <w:szCs w:val="24"/>
         </w:rPr>
         <w:t>supplier_name_accusative</w:t>
       </w:r>
-      <w:r>
-        <w:rPr>
-          <w:rFonts w:ascii="Times New Roman" w:eastAsia="Times New Roman" w:hAnsi="Times New Roman" w:cs="Times New Roman"/>
-          <w:sz w:val="24"/>
-          <w:szCs w:val="24"/>
-          <w:shd w:val="clear" w:color="auto" w:fill="FF9900"/>
-        </w:rPr>
-        <w:t xml:space="preserve"> }}</w:t>
-      </w:r>
-      <w:r>
-        <w:rPr>
-          <w:rFonts w:ascii="Times New Roman" w:eastAsia="Times New Roman" w:hAnsi="Times New Roman" w:cs="Times New Roman"/>
-          <w:sz w:val="24"/>
-          <w:szCs w:val="24"/>
-        </w:rPr>
-        <w:t xml:space="preserve"> (</w:t>
-      </w:r>
-      <w:r>
-        <w:rPr>
-          <w:rFonts w:ascii="Times New Roman" w:eastAsia="Times New Roman" w:hAnsi="Times New Roman" w:cs="Times New Roman"/>
-          <w:sz w:val="24"/>
-          <w:szCs w:val="24"/>
-        </w:rPr>
-        <w:t>{{ supplier_code_label }}</w:t>
-      </w:r>
-      <w:r>
-        <w:rPr>
-          <w:rFonts w:ascii="Times New Roman" w:eastAsia="Times New Roman" w:hAnsi="Times New Roman" w:cs="Times New Roman"/>
-          <w:sz w:val="24"/>
-          <w:szCs w:val="24"/>
-        </w:rPr>
-        <w:t xml:space="preserve">: </w:t>
-      </w:r>
-      <w:r>
-        <w:rPr>
-          <w:rFonts w:ascii="Times New Roman" w:eastAsia="Times New Roman" w:hAnsi="Times New Roman" w:cs="Times New Roman"/>
-          <w:sz w:val="24"/>
-          <w:szCs w:val="24"/>
-        </w:rPr>
-        <w:t>{{ supplier_code }}</w:t>
-      </w:r>
-      <w:r>
-        <w:rPr>
-          <w:rFonts w:ascii="Times New Roman" w:eastAsia="Times New Roman" w:hAnsi="Times New Roman" w:cs="Times New Roman"/>
-          <w:sz w:val="24"/>
-          <w:szCs w:val="24"/>
-        </w:rPr>
-        <w:t>) про результати розгляду звернення шляхом оприлюднення відповідного рішення на вебпорталі Уповноваженого органу.</w:t>
+      <w:proofErr w:type="spellEnd"/>
+      <w:r>
+        <w:rPr>
+          <w:rFonts w:ascii="Times New Roman" w:eastAsia="Times New Roman" w:hAnsi="Times New Roman" w:cs="Times New Roman"/>
+          <w:sz w:val="24"/>
+          <w:szCs w:val="24"/>
+        </w:rPr>
+        <w:t xml:space="preserve"> }} ({{ </w:t>
+      </w:r>
+      <w:proofErr w:type="spellStart"/>
+      <w:r>
+        <w:rPr>
+          <w:rFonts w:ascii="Times New Roman" w:eastAsia="Times New Roman" w:hAnsi="Times New Roman" w:cs="Times New Roman"/>
+          <w:sz w:val="24"/>
+          <w:szCs w:val="24"/>
+        </w:rPr>
+        <w:t>supplier_code_label</w:t>
+      </w:r>
+      <w:proofErr w:type="spellEnd"/>
+      <w:r>
+        <w:rPr>
+          <w:rFonts w:ascii="Times New Roman" w:eastAsia="Times New Roman" w:hAnsi="Times New Roman" w:cs="Times New Roman"/>
+          <w:sz w:val="24"/>
+          <w:szCs w:val="24"/>
+        </w:rPr>
+        <w:t xml:space="preserve"> }}: {{ </w:t>
+      </w:r>
+      <w:proofErr w:type="spellStart"/>
+      <w:r>
+        <w:rPr>
+          <w:rFonts w:ascii="Times New Roman" w:eastAsia="Times New Roman" w:hAnsi="Times New Roman" w:cs="Times New Roman"/>
+          <w:sz w:val="24"/>
+          <w:szCs w:val="24"/>
+        </w:rPr>
+        <w:t>supplier_code</w:t>
+      </w:r>
+      <w:proofErr w:type="spellEnd"/>
+      <w:r>
+        <w:rPr>
+          <w:rFonts w:ascii="Times New Roman" w:eastAsia="Times New Roman" w:hAnsi="Times New Roman" w:cs="Times New Roman"/>
+          <w:sz w:val="24"/>
+          <w:szCs w:val="24"/>
+        </w:rPr>
+        <w:t xml:space="preserve"> }}) про результати розгляду звернення шляхом оприлюднення відповідного рішення на </w:t>
+      </w:r>
+      <w:proofErr w:type="spellStart"/>
+      <w:r>
+        <w:rPr>
+          <w:rFonts w:ascii="Times New Roman" w:eastAsia="Times New Roman" w:hAnsi="Times New Roman" w:cs="Times New Roman"/>
+          <w:sz w:val="24"/>
+          <w:szCs w:val="24"/>
+        </w:rPr>
+        <w:t>вебпорталі</w:t>
+      </w:r>
+      <w:proofErr w:type="spellEnd"/>
+      <w:r>
+        <w:rPr>
+          <w:rFonts w:ascii="Times New Roman" w:eastAsia="Times New Roman" w:hAnsi="Times New Roman" w:cs="Times New Roman"/>
+          <w:sz w:val="24"/>
+          <w:szCs w:val="24"/>
+        </w:rPr>
+        <w:t xml:space="preserve"> Уповноваженого органу.</w:t>
       </w:r>
     </w:p>
     <w:p>
@@ -3126,7 +3277,6 @@
           <w:bCs/>
           <w:sz w:val="24"/>
           <w:szCs w:val="24"/>
-          <w:shd w:val="clear" w:color="auto" w:fill="FF9900"/>
         </w:rPr>
       </w:pPr>
       <w:r>
@@ -3178,7 +3328,9 @@
           <w:szCs w:val="24"/>
         </w:rPr>
         <w:tab/>
-      </w:r>
+        <w:t xml:space="preserve">{{ </w:t>
+      </w:r>
+      <w:proofErr w:type="spellStart"/>
       <w:r>
         <w:rPr>
           <w:rFonts w:ascii="Times New Roman" w:eastAsia="Times New Roman" w:hAnsi="Times New Roman" w:cs="Times New Roman"/>
@@ -3186,9 +3338,19 @@
           <w:bCs/>
           <w:sz w:val="24"/>
           <w:szCs w:val="24"/>
-          <w:shd w:val="clear" w:color="auto" w:fill="FF9900"/>
-        </w:rPr>
-        <w:t>{{ officer_name }}</w:t>
+        </w:rPr>
+        <w:t>officer_name</w:t>
+      </w:r>
+      <w:proofErr w:type="spellEnd"/>
+      <w:r>
+        <w:rPr>
+          <w:rFonts w:ascii="Times New Roman" w:eastAsia="Times New Roman" w:hAnsi="Times New Roman" w:cs="Times New Roman"/>
+          <w:b/>
+          <w:bCs/>
+          <w:sz w:val="24"/>
+          <w:szCs w:val="24"/>
+        </w:rPr>
+        <w:t xml:space="preserve"> }}</w:t>
       </w:r>
     </w:p>
     <w:p>
@@ -3933,7 +4095,6 @@
   <w:style w:type="character" w:default="1" w:styleId="a0">
     <w:name w:val="Default Paragraph Font"/>
     <w:uiPriority w:val="1"/>
-    <w:semiHidden/>
     <w:unhideWhenUsed/>
   </w:style>
   <w:style w:type="table" w:default="1" w:styleId="a1">
@@ -4033,6 +4194,29 @@
       <w:tblStyleRowBandSize w:val="1"/>
       <w:tblStyleColBandSize w:val="1"/>
     </w:tblPr>
+  </w:style>
+  <w:style w:type="character" w:styleId="a8">
+    <w:name w:val="Hyperlink"/>
+    <w:basedOn w:val="a0"/>
+    <w:uiPriority w:val="99"/>
+    <w:unhideWhenUsed/>
+    <w:rsid w:val="005B652F"/>
+    <w:rPr>
+      <w:color w:val="0000FF" w:themeColor="hyperlink"/>
+      <w:u w:val="single"/>
+    </w:rPr>
+  </w:style>
+  <w:style w:type="character" w:styleId="a9">
+    <w:name w:val="Unresolved Mention"/>
+    <w:basedOn w:val="a0"/>
+    <w:uiPriority w:val="99"/>
+    <w:semiHidden/>
+    <w:unhideWhenUsed/>
+    <w:rsid w:val="005B652F"/>
+    <w:rPr>
+      <w:color w:val="605E5C"/>
+      <w:shd w:val="clear" w:color="auto" w:fill="E1DFDD"/>
+    </w:rPr>
   </w:style>
 </w:styles>
 </file>

</xml_diff>

<commit_message>
Merge PQM NEXT 2026-09-16 with WEB safe-mode and durable NAZK evidence
</commit_message>
<xml_diff>
--- a/templates/violation_protocols/decline_p49_1_2.docx
+++ b/templates/violation_protocols/decline_p49_1_2.docx
@@ -1705,10 +1705,9 @@
       </w:pPr>
       <w:r>
         <w:rPr>
-          <w:rFonts w:ascii="Times New Roman" w:hAnsi="Times New Roman" w:eastAsia="Times New Roman" w:cs="Times New Roman"/>
-          <w:sz w:val="24"/>
-          <w:szCs w:val="24"/>
-          <w:lang w:val="uk-UA"/>
+          <w:rFonts w:ascii="Times New Roman" w:eastAsia="Times New Roman" w:hAnsi="Times New Roman" w:cs="Times New Roman"/>
+          <w:sz w:val="24"/>
+          <w:szCs w:val="24"/>
         </w:rPr>
         <w:t>{{#if decision.civil_code_basis == "applicable"}}</w:t>
       </w:r>
@@ -1729,10 +1728,9 @@
       </w:pPr>
       <w:r>
         <w:rPr>
-          <w:rFonts w:ascii="Times New Roman" w:hAnsi="Times New Roman" w:eastAsia="Times New Roman" w:cs="Times New Roman"/>
-          <w:sz w:val="24"/>
-          <w:szCs w:val="24"/>
-          <w:lang w:val="uk-UA"/>
+          <w:rFonts w:ascii="Times New Roman" w:eastAsia="Times New Roman" w:hAnsi="Times New Roman" w:cs="Times New Roman"/>
+          <w:sz w:val="24"/>
+          <w:szCs w:val="24"/>
         </w:rPr>
         <w:t>Відповідно до роз’яснень Міністерства економіки України, що опубліковані за посиланнями:</w:t>
       </w:r>
@@ -1743,27 +1741,27 @@
           <w:tab w:val="left" w:pos="993"/>
         </w:tabs>
         <w:spacing w:after="0" w:line="240" w:lineRule="auto"/>
-        <w:ind w:left="720"/>
-        <w:jc w:val="left"/>
-        <w:rPr>
-          <w:rFonts w:ascii="Times New Roman" w:eastAsia="Times New Roman" w:hAnsi="Times New Roman" w:cs="Times New Roman"/>
-          <w:sz w:val="24"/>
-          <w:szCs w:val="24"/>
+        <w:ind w:left="720" w:hanging="720"/>
+        <w:rPr>
+          <w:rFonts w:ascii="Times New Roman" w:eastAsia="Times New Roman" w:hAnsi="Times New Roman" w:cs="Times New Roman"/>
         </w:rPr>
       </w:pPr>
       <w:hyperlink r:id="rId5" w:history="1">
         <w:r>
           <w:rPr>
-            <w:rFonts w:ascii="Times New Roman" w:hAnsi="Times New Roman" w:eastAsia="Times New Roman" w:cs="Times New Roman"/>
-            <w:sz w:val="24"/>
-            <w:szCs w:val="24"/>
-            <w:lang w:val="uk-UA"/>
+            <w:rFonts w:ascii="Times New Roman" w:eastAsia="Times New Roman" w:hAnsi="Times New Roman" w:cs="Times New Roman"/>
             <w:color w:val="0563C1"/>
             <w:u w:val="single"/>
           </w:rPr>
           <w:t>https://www.me.gov.ua/InfoRez/Details?id=3d8b5293-1542-45e7-8cab-60768b9ecc09&amp;lang=uk-UA</w:t>
         </w:r>
       </w:hyperlink>
+      <w:r>
+        <w:rPr>
+          <w:rFonts w:ascii="Times New Roman" w:hAnsi="Times New Roman" w:cs="Times New Roman"/>
+        </w:rPr>
+        <w:t>;</w:t>
+      </w:r>
     </w:p>
     <w:p>
       <w:pPr>
@@ -1771,27 +1769,27 @@
           <w:tab w:val="left" w:pos="993"/>
         </w:tabs>
         <w:spacing w:after="0" w:line="240" w:lineRule="auto"/>
-        <w:ind w:left="720"/>
-        <w:jc w:val="left"/>
-        <w:rPr>
-          <w:rFonts w:ascii="Times New Roman" w:eastAsia="Times New Roman" w:hAnsi="Times New Roman" w:cs="Times New Roman"/>
-          <w:sz w:val="24"/>
-          <w:szCs w:val="24"/>
+        <w:ind w:left="720" w:hanging="720"/>
+        <w:rPr>
+          <w:rFonts w:ascii="Times New Roman" w:eastAsia="Times New Roman" w:hAnsi="Times New Roman" w:cs="Times New Roman"/>
         </w:rPr>
       </w:pPr>
       <w:hyperlink r:id="rId6" w:history="1">
         <w:r>
           <w:rPr>
-            <w:rFonts w:ascii="Times New Roman" w:hAnsi="Times New Roman" w:eastAsia="Times New Roman" w:cs="Times New Roman"/>
-            <w:sz w:val="24"/>
-            <w:szCs w:val="24"/>
-            <w:lang w:val="uk-UA"/>
+            <w:rFonts w:ascii="Times New Roman" w:eastAsia="Times New Roman" w:hAnsi="Times New Roman" w:cs="Times New Roman"/>
             <w:color w:val="0563C1"/>
             <w:u w:val="single"/>
           </w:rPr>
           <w:t>https://me.gov.ua/InfoRez/Details?id=1c50d66b-a34f-4b83-8ae3-e1fdea208d80&amp;lang=uk-UA</w:t>
         </w:r>
       </w:hyperlink>
+      <w:r>
+        <w:rPr>
+          <w:rFonts w:ascii="Times New Roman" w:hAnsi="Times New Roman" w:cs="Times New Roman"/>
+        </w:rPr>
+        <w:t>;</w:t>
+      </w:r>
     </w:p>
     <w:p>
       <w:pPr>
@@ -1799,27 +1797,49 @@
           <w:tab w:val="left" w:pos="993"/>
         </w:tabs>
         <w:spacing w:after="0" w:line="240" w:lineRule="auto"/>
-        <w:ind w:left="720"/>
-        <w:jc w:val="left"/>
-        <w:rPr>
-          <w:rFonts w:ascii="Times New Roman" w:eastAsia="Times New Roman" w:hAnsi="Times New Roman" w:cs="Times New Roman"/>
-          <w:sz w:val="24"/>
-          <w:szCs w:val="24"/>
+        <w:ind w:left="720" w:hanging="720"/>
+        <w:rPr>
+          <w:rFonts w:ascii="Times New Roman" w:eastAsia="Times New Roman" w:hAnsi="Times New Roman" w:cs="Times New Roman"/>
         </w:rPr>
       </w:pPr>
       <w:hyperlink r:id="rId7" w:history="1">
         <w:r>
           <w:rPr>
-            <w:rFonts w:ascii="Times New Roman" w:hAnsi="Times New Roman" w:eastAsia="Times New Roman" w:cs="Times New Roman"/>
-            <w:sz w:val="24"/>
-            <w:szCs w:val="24"/>
-            <w:lang w:val="uk-UA"/>
+            <w:rFonts w:ascii="Times New Roman" w:eastAsia="Times New Roman" w:hAnsi="Times New Roman" w:cs="Times New Roman"/>
             <w:color w:val="0563C1"/>
             <w:u w:val="single"/>
           </w:rPr>
           <w:t>https://me.gov.ua/InfoRez/Details?id=011d5df6-768e-46e9-9f66-86a71737584d&amp;lang=uk-UA</w:t>
         </w:r>
       </w:hyperlink>
+      <w:r>
+        <w:rPr>
+          <w:rFonts w:ascii="Times New Roman" w:hAnsi="Times New Roman" w:cs="Times New Roman"/>
+        </w:rPr>
+        <w:t>;</w:t>
+      </w:r>
+    </w:p>
+    <w:p>
+      <w:pPr>
+        <w:tabs>
+          <w:tab w:val="left" w:pos="993"/>
+        </w:tabs>
+        <w:spacing w:after="0" w:line="240" w:lineRule="auto"/>
+        <w:jc w:val="both"/>
+        <w:rPr>
+          <w:rFonts w:ascii="Times New Roman" w:eastAsia="Times New Roman" w:hAnsi="Times New Roman" w:cs="Times New Roman"/>
+          <w:sz w:val="24"/>
+          <w:szCs w:val="24"/>
+        </w:rPr>
+      </w:pPr>
+      <w:r>
+        <w:rPr>
+          <w:rFonts w:ascii="Times New Roman" w:eastAsia="Times New Roman" w:hAnsi="Times New Roman" w:cs="Times New Roman"/>
+          <w:sz w:val="24"/>
+          <w:szCs w:val="24"/>
+        </w:rPr>
+        <w:t>Закон України «Про публічні закупівлі» (далі – Закон) визначає правові та економічні засади здійснення закупівель товарів, робіт і послуг для забезпечення потреб держави, територіальних громад та об’єднаних територіальних громад.</w:t>
+      </w:r>
     </w:p>
     <w:p>
       <w:pPr>
@@ -1837,12 +1857,11 @@
       </w:pPr>
       <w:r>
         <w:rPr>
-          <w:rFonts w:ascii="Times New Roman" w:hAnsi="Times New Roman" w:eastAsia="Times New Roman" w:cs="Times New Roman"/>
-          <w:sz w:val="24"/>
-          <w:szCs w:val="24"/>
-          <w:lang w:val="uk-UA"/>
-        </w:rPr>
-        <w:t>Закон України «Про публічні закупівлі» (далі – Закон) визначає правові та економічні засади здійснення закупівель товарів, робіт і послуг для забезпечення потреб держави, територіальних громад та об’єднаних територіальних громад.</w:t>
+          <w:rFonts w:ascii="Times New Roman" w:eastAsia="Times New Roman" w:hAnsi="Times New Roman" w:cs="Times New Roman"/>
+          <w:sz w:val="24"/>
+          <w:szCs w:val="24"/>
+        </w:rPr>
+        <w:t>Відповідно до ч. 1 ст. 253 Цивільного кодексу України перебіг строку починається з наступного дня після відповідної календарної дати або настання події, з якою пов’язано його початок.</w:t>
       </w:r>
     </w:p>
     <w:p>
@@ -1861,12 +1880,11 @@
       </w:pPr>
       <w:r>
         <w:rPr>
-          <w:rFonts w:ascii="Times New Roman" w:hAnsi="Times New Roman" w:eastAsia="Times New Roman" w:cs="Times New Roman"/>
-          <w:sz w:val="24"/>
-          <w:szCs w:val="24"/>
-          <w:lang w:val="uk-UA"/>
-        </w:rPr>
-        <w:t>Відповідно до ч. 1 ст. 253 Цивільного кодексу України перебіг строку починається з наступного дня після відповідної календарної дати або настання події, з якою пов’язано його початок.</w:t>
+          <w:rFonts w:ascii="Times New Roman" w:eastAsia="Times New Roman" w:hAnsi="Times New Roman" w:cs="Times New Roman"/>
+          <w:sz w:val="24"/>
+          <w:szCs w:val="24"/>
+        </w:rPr>
+        <w:t>За змістом ч. 5 ст. 254 Цивільного кодексу України якщо останній день строку припадає на вихідний, святковий або інший неробочий день, що визначений відповідно до закону у місці вчинення певної дії, днем закінчення строку є перший за ним робочий день.</w:t>
       </w:r>
     </w:p>
     <w:p>
@@ -1885,12 +1903,12 @@
       </w:pPr>
       <w:r>
         <w:rPr>
-          <w:rFonts w:ascii="Times New Roman" w:hAnsi="Times New Roman" w:eastAsia="Times New Roman" w:cs="Times New Roman"/>
-          <w:sz w:val="24"/>
-          <w:szCs w:val="24"/>
-          <w:lang w:val="uk-UA"/>
-        </w:rPr>
-        <w:t>За змістом ч. 5 ст. 254 Цивільного кодексу України якщо останній день строку припадає на вихідний, святковий або інший неробочий день, що визначений відповідно до закону у місці вчинення певної дії, днем закінчення строку є перший за ним робочий день.</w:t>
+          <w:rFonts w:ascii="Times New Roman" w:eastAsia="Times New Roman" w:hAnsi="Times New Roman" w:cs="Times New Roman"/>
+          <w:sz w:val="24"/>
+          <w:szCs w:val="24"/>
+        </w:rPr>
+        <w:lastRenderedPageBreak/>
+        <w:t>Частиною 1 ст. 255 Цивільного кодексу України встановлено, якщо строк встановлено для вчинення дії, вона може бути вчинена до закінчення останнього дня строку.</w:t>
       </w:r>
     </w:p>
     <w:p>
@@ -1909,34 +1927,9 @@
       </w:pPr>
       <w:r>
         <w:rPr>
-          <w:rFonts w:ascii="Times New Roman" w:hAnsi="Times New Roman" w:eastAsia="Times New Roman" w:cs="Times New Roman"/>
-          <w:sz w:val="24"/>
-          <w:szCs w:val="24"/>
-          <w:lang w:val="uk-UA"/>
-        </w:rPr>
-        <w:t>Частиною 1 ст. 255 Цивільного кодексу України встановлено, якщо строк встановлено для вчинення дії, вона може бути вчинена до закінчення останнього дня строку.</w:t>
-      </w:r>
-    </w:p>
-    <w:p>
-      <w:pPr>
-        <w:tabs>
-          <w:tab w:val="left" w:pos="993"/>
-        </w:tabs>
-        <w:spacing w:after="0" w:line="240" w:lineRule="auto"/>
-        <w:ind w:firstLine="567"/>
-        <w:jc w:val="both"/>
-        <w:rPr>
-          <w:rFonts w:ascii="Times New Roman" w:eastAsia="Times New Roman" w:hAnsi="Times New Roman" w:cs="Times New Roman"/>
-          <w:sz w:val="24"/>
-          <w:szCs w:val="24"/>
-        </w:rPr>
-      </w:pPr>
-      <w:r>
-        <w:rPr>
-          <w:rFonts w:ascii="Times New Roman" w:hAnsi="Times New Roman" w:eastAsia="Times New Roman" w:cs="Times New Roman"/>
-          <w:sz w:val="24"/>
-          <w:szCs w:val="24"/>
-          <w:lang w:val="uk-UA"/>
+          <w:rFonts w:ascii="Times New Roman" w:eastAsia="Times New Roman" w:hAnsi="Times New Roman" w:cs="Times New Roman"/>
+          <w:sz w:val="24"/>
+          <w:szCs w:val="24"/>
         </w:rPr>
         <w:t>{{/if}}</w:t>
       </w:r>
@@ -1966,7 +1959,6 @@
           <w:sz w:val="24"/>
           <w:szCs w:val="24"/>
         </w:rPr>
-        <w:lastRenderedPageBreak/>
         <w:t>За результатами розгляду встановлено:</w:t>
       </w:r>
     </w:p>
@@ -4095,6 +4087,7 @@
   <w:style w:type="character" w:default="1" w:styleId="a0">
     <w:name w:val="Default Paragraph Font"/>
     <w:uiPriority w:val="1"/>
+    <w:semiHidden/>
     <w:unhideWhenUsed/>
   </w:style>
   <w:style w:type="table" w:default="1" w:styleId="a1">

</xml_diff>